<commit_message>
Deploying to gh-pages from @ Morrison-Lab/psc@ba92b4d7de17d3786f8170e7624796ee2f0dc8ae 🚀
</commit_message>
<xml_diff>
--- a/chapters/coding-practices.docx
+++ b/chapters/coding-practices.docx
@@ -15,7 +15,7 @@
         <w:pStyle w:val="Date"/>
       </w:pPr>
       <w:r>
-        <w:t xml:space="preserve">Last modified: 2026-10-11 20:59:42 (PDT)</w:t>
+        <w:t xml:space="preserve">Last modified: 2026-10-11 21:04:29 (PDT)</w:t>
       </w:r>
     </w:p>
     <w:p>
@@ -39127,7 +39127,7 @@
       </w:r>
     </w:p>
     <w:bookmarkEnd w:id="337"/>
-    <w:bookmarkStart w:id="360" w:name="sec-r-resources"/>
+    <w:bookmarkStart w:id="389" w:name="sec-r-resources"/>
     <w:p>
       <w:pPr>
         <w:pStyle w:val="Heading2"/>
@@ -39136,13 +39136,13 @@
         <w:t xml:space="preserve">47 Additional Resources</w:t>
       </w:r>
     </w:p>
-    <w:bookmarkStart w:id="338" w:name="r-package-development"/>
+    <w:bookmarkStart w:id="344" w:name="learning-r"/>
     <w:p>
       <w:pPr>
         <w:pStyle w:val="Heading3"/>
       </w:pPr>
       <w:r>
-        <w:t xml:space="preserve">47.1 R Package Development</w:t>
+        <w:t xml:space="preserve">47.1 Learning R</w:t>
       </w:r>
     </w:p>
     <w:p>
@@ -39154,19 +39154,19 @@
         </w:numPr>
       </w:pPr>
       <w:r>
-        <w:t xml:space="preserve">R Packages</w:t>
-      </w:r>
-      <w:r>
-        <w:t xml:space="preserve"> </w:t>
-      </w:r>
-      <w:r>
-        <w:t xml:space="preserve">(Wickham and Bryan 2023)</w:t>
-      </w:r>
-      <w:r>
-        <w:t xml:space="preserve"> </w:t>
-      </w:r>
-      <w:r>
-        <w:t xml:space="preserve">- comprehensive guide to R package development</w:t>
+        <w:t xml:space="preserve">R for Data Science</w:t>
+      </w:r>
+      <w:r>
+        <w:t xml:space="preserve"> </w:t>
+      </w:r>
+      <w:r>
+        <w:t xml:space="preserve">(Wickham et al. 2023)</w:t>
+      </w:r>
+      <w:r>
+        <w:t xml:space="preserve"> </w:t>
+      </w:r>
+      <w:r>
+        <w:t xml:space="preserve">- learn data science with the tidyverse</w:t>
       </w:r>
     </w:p>
     <w:p>
@@ -39177,20 +39177,19 @@
           <w:numId w:val="1076"/>
         </w:numPr>
       </w:pPr>
-      <w:r>
-        <w:t xml:space="preserve">Tidyverse design guide</w:t>
-      </w:r>
-      <w:r>
-        <w:t xml:space="preserve"> </w:t>
-      </w:r>
-      <w:r>
-        <w:t xml:space="preserve">(Wickham 2023)</w:t>
-      </w:r>
-      <w:r>
-        <w:t xml:space="preserve"> </w:t>
-      </w:r>
-      <w:r>
-        <w:t xml:space="preserve">- principles for designing R packages and APIs that are intuitive, composable, and consistent with tidyverse philosophy</w:t>
+      <w:hyperlink r:id="rId338">
+        <w:r>
+          <w:rPr>
+            <w:rStyle w:val="Hyperlink"/>
+          </w:rPr>
+          <w:t xml:space="preserve">R for Epidemiology</w:t>
+        </w:r>
+      </w:hyperlink>
+      <w:r>
+        <w:t xml:space="preserve"> </w:t>
+      </w:r>
+      <w:r>
+        <w:t xml:space="preserve">- an introduction to R, with epidemiology examples</w:t>
       </w:r>
     </w:p>
     <w:p>
@@ -39199,6 +39198,682 @@
         <w:numPr>
           <w:ilvl w:val="0"/>
           <w:numId w:val="1076"/>
+        </w:numPr>
+      </w:pPr>
+      <w:hyperlink r:id="rId339">
+        <w:r>
+          <w:rPr>
+            <w:rStyle w:val="Hyperlink"/>
+          </w:rPr>
+          <w:t xml:space="preserve">The Epidemiologist R Handbook</w:t>
+        </w:r>
+      </w:hyperlink>
+      <w:r>
+        <w:t xml:space="preserve"> </w:t>
+      </w:r>
+      <w:r>
+        <w:t xml:space="preserve">- task-oriented reference for applied epidemiology</w:t>
+      </w:r>
+    </w:p>
+    <w:p>
+      <w:pPr>
+        <w:pStyle w:val="Compact"/>
+        <w:numPr>
+          <w:ilvl w:val="0"/>
+          <w:numId w:val="1076"/>
+        </w:numPr>
+      </w:pPr>
+      <w:hyperlink r:id="rId340">
+        <w:r>
+          <w:rPr>
+            <w:rStyle w:val="Hyperlink"/>
+          </w:rPr>
+          <w:t xml:space="preserve">R Graphics Cookbook</w:t>
+        </w:r>
+      </w:hyperlink>
+      <w:r>
+        <w:t xml:space="preserve"> </w:t>
+      </w:r>
+      <w:r>
+        <w:t xml:space="preserve">- recipes for common</w:t>
+      </w:r>
+      <w:r>
+        <w:t xml:space="preserve"> </w:t>
+      </w:r>
+      <w:r>
+        <w:rPr>
+          <w:rStyle w:val="VerbatimChar"/>
+        </w:rPr>
+        <w:t xml:space="preserve">{ggplot2}</w:t>
+      </w:r>
+      <w:r>
+        <w:t xml:space="preserve"> </w:t>
+      </w:r>
+      <w:r>
+        <w:t xml:space="preserve">figures</w:t>
+      </w:r>
+    </w:p>
+    <w:p>
+      <w:pPr>
+        <w:pStyle w:val="Compact"/>
+        <w:numPr>
+          <w:ilvl w:val="0"/>
+          <w:numId w:val="1076"/>
+        </w:numPr>
+      </w:pPr>
+      <w:hyperlink r:id="rId341">
+        <w:r>
+          <w:rPr>
+            <w:rStyle w:val="Hyperlink"/>
+          </w:rPr>
+          <w:t xml:space="preserve">R for Reproducible Scientific Analysis</w:t>
+        </w:r>
+      </w:hyperlink>
+      <w:r>
+        <w:t xml:space="preserve"> </w:t>
+      </w:r>
+      <w:r>
+        <w:t xml:space="preserve">- Software Carpentry’s introductory lesson</w:t>
+      </w:r>
+    </w:p>
+    <w:p>
+      <w:pPr>
+        <w:pStyle w:val="Compact"/>
+        <w:numPr>
+          <w:ilvl w:val="0"/>
+          <w:numId w:val="1076"/>
+        </w:numPr>
+      </w:pPr>
+      <w:hyperlink r:id="rId342">
+        <w:r>
+          <w:rPr>
+            <w:rStyle w:val="Hyperlink"/>
+          </w:rPr>
+          <w:t xml:space="preserve">Building reproducible analytical pipelines with R</w:t>
+        </w:r>
+      </w:hyperlink>
+      <w:r>
+        <w:t xml:space="preserve"> </w:t>
+      </w:r>
+      <w:r>
+        <w:t xml:space="preserve">- project-level reproducibility in R</w:t>
+      </w:r>
+    </w:p>
+    <w:p>
+      <w:pPr>
+        <w:pStyle w:val="Compact"/>
+        <w:numPr>
+          <w:ilvl w:val="0"/>
+          <w:numId w:val="1076"/>
+        </w:numPr>
+      </w:pPr>
+      <w:hyperlink r:id="rId343">
+        <w:r>
+          <w:rPr>
+            <w:rStyle w:val="Hyperlink"/>
+          </w:rPr>
+          <w:t xml:space="preserve">Posit Recipes</w:t>
+        </w:r>
+      </w:hyperlink>
+      <w:r>
+        <w:t xml:space="preserve"> </w:t>
+      </w:r>
+      <w:r>
+        <w:t xml:space="preserve">- short, task-focused R code snippets</w:t>
+      </w:r>
+    </w:p>
+    <w:bookmarkEnd w:id="344"/>
+    <w:bookmarkStart w:id="349" w:name="coming-to-r-from-sas"/>
+    <w:p>
+      <w:pPr>
+        <w:pStyle w:val="Heading3"/>
+      </w:pPr>
+      <w:r>
+        <w:t xml:space="preserve">47.2 Coming to R from SAS</w:t>
+      </w:r>
+    </w:p>
+    <w:p>
+      <w:pPr>
+        <w:pStyle w:val="Compact"/>
+        <w:numPr>
+          <w:ilvl w:val="0"/>
+          <w:numId w:val="1077"/>
+        </w:numPr>
+      </w:pPr>
+      <w:hyperlink r:id="rId345">
+        <w:r>
+          <w:rPr>
+            <w:rStyle w:val="Hyperlink"/>
+          </w:rPr>
+          <w:t xml:space="preserve">The sassy system</w:t>
+        </w:r>
+      </w:hyperlink>
+      <w:r>
+        <w:t xml:space="preserve"> </w:t>
+      </w:r>
+      <w:r>
+        <w:t xml:space="preserve">- packages that bring familiar SAS concepts to R;</w:t>
+      </w:r>
+      <w:r>
+        <w:t xml:space="preserve"> </w:t>
+      </w:r>
+      <w:r>
+        <w:t xml:space="preserve">its</w:t>
+      </w:r>
+      <w:r>
+        <w:t xml:space="preserve"> </w:t>
+      </w:r>
+      <w:hyperlink r:id="rId346">
+        <w:r>
+          <w:rPr>
+            <w:rStyle w:val="VerbatimChar"/>
+          </w:rPr>
+          <w:t xml:space="preserve">{procs}</w:t>
+        </w:r>
+      </w:hyperlink>
+      <w:r>
+        <w:t xml:space="preserve"> </w:t>
+      </w:r>
+      <w:r>
+        <w:t xml:space="preserve">package</w:t>
+      </w:r>
+      <w:r>
+        <w:t xml:space="preserve"> </w:t>
+      </w:r>
+      <w:r>
+        <w:t xml:space="preserve">provides versions of</w:t>
+      </w:r>
+      <w:r>
+        <w:t xml:space="preserve"> </w:t>
+      </w:r>
+      <w:r>
+        <w:rPr>
+          <w:rStyle w:val="VerbatimChar"/>
+        </w:rPr>
+        <w:t xml:space="preserve">proc freq</w:t>
+      </w:r>
+      <w:r>
+        <w:t xml:space="preserve">,</w:t>
+      </w:r>
+      <w:r>
+        <w:t xml:space="preserve"> </w:t>
+      </w:r>
+      <w:r>
+        <w:rPr>
+          <w:rStyle w:val="VerbatimChar"/>
+        </w:rPr>
+        <w:t xml:space="preserve">proc means</w:t>
+      </w:r>
+      <w:r>
+        <w:t xml:space="preserve">,</w:t>
+      </w:r>
+      <w:r>
+        <w:t xml:space="preserve"> </w:t>
+      </w:r>
+      <w:r>
+        <w:rPr>
+          <w:rStyle w:val="VerbatimChar"/>
+        </w:rPr>
+        <w:t xml:space="preserve">proc ttest</w:t>
+      </w:r>
+      <w:r>
+        <w:t xml:space="preserve">,</w:t>
+      </w:r>
+      <w:r>
+        <w:t xml:space="preserve"> </w:t>
+      </w:r>
+      <w:r>
+        <w:rPr>
+          <w:rStyle w:val="VerbatimChar"/>
+        </w:rPr>
+        <w:t xml:space="preserve">proc reg</w:t>
+      </w:r>
+      <w:r>
+        <w:t xml:space="preserve">, and other common procedures</w:t>
+      </w:r>
+    </w:p>
+    <w:p>
+      <w:pPr>
+        <w:pStyle w:val="Compact"/>
+        <w:numPr>
+          <w:ilvl w:val="0"/>
+          <w:numId w:val="1077"/>
+        </w:numPr>
+      </w:pPr>
+      <w:hyperlink r:id="rId347">
+        <w:r>
+          <w:rPr>
+            <w:rStyle w:val="Hyperlink"/>
+          </w:rPr>
+          <w:t xml:space="preserve">R for SAS and SPSS Users</w:t>
+        </w:r>
+      </w:hyperlink>
+      <w:r>
+        <w:t xml:space="preserve"> </w:t>
+      </w:r>
+      <w:r>
+        <w:t xml:space="preserve">(Muenchen) - common SAS and SPSS tasks, done in R</w:t>
+      </w:r>
+    </w:p>
+    <w:p>
+      <w:pPr>
+        <w:pStyle w:val="Compact"/>
+        <w:numPr>
+          <w:ilvl w:val="0"/>
+          <w:numId w:val="1077"/>
+        </w:numPr>
+      </w:pPr>
+      <w:hyperlink r:id="rId348">
+        <w:r>
+          <w:rPr>
+            <w:rStyle w:val="Hyperlink"/>
+          </w:rPr>
+          <w:t xml:space="preserve">SAS and R</w:t>
+        </w:r>
+      </w:hyperlink>
+      <w:r>
+        <w:t xml:space="preserve"> </w:t>
+      </w:r>
+      <w:r>
+        <w:t xml:space="preserve">(Kleinman and Horton) - side-by-side SAS and R code for data management and analysis</w:t>
+      </w:r>
+    </w:p>
+    <w:bookmarkEnd w:id="349"/>
+    <w:bookmarkStart w:id="356" w:name="general-r-programming"/>
+    <w:p>
+      <w:pPr>
+        <w:pStyle w:val="Heading3"/>
+      </w:pPr>
+      <w:r>
+        <w:t xml:space="preserve">47.3 General R Programming</w:t>
+      </w:r>
+    </w:p>
+    <w:p>
+      <w:pPr>
+        <w:pStyle w:val="Compact"/>
+        <w:numPr>
+          <w:ilvl w:val="0"/>
+          <w:numId w:val="1078"/>
+        </w:numPr>
+      </w:pPr>
+      <w:r>
+        <w:t xml:space="preserve">Advanced R</w:t>
+      </w:r>
+      <w:r>
+        <w:t xml:space="preserve"> </w:t>
+      </w:r>
+      <w:r>
+        <w:t xml:space="preserve">(Wickham 2019)</w:t>
+      </w:r>
+      <w:r>
+        <w:t xml:space="preserve"> </w:t>
+      </w:r>
+      <w:r>
+        <w:t xml:space="preserve">- deep dive into R programming and internals, including</w:t>
+      </w:r>
+      <w:r>
+        <w:t xml:space="preserve"> </w:t>
+      </w:r>
+      <w:hyperlink r:id="rId350">
+        <w:r>
+          <w:rPr>
+            <w:rStyle w:val="Hyperlink"/>
+          </w:rPr>
+          <w:t xml:space="preserve">functions</w:t>
+        </w:r>
+      </w:hyperlink>
+      <w:r>
+        <w:t xml:space="preserve">,</w:t>
+      </w:r>
+      <w:r>
+        <w:t xml:space="preserve"> </w:t>
+      </w:r>
+      <w:hyperlink r:id="rId351">
+        <w:r>
+          <w:rPr>
+            <w:rStyle w:val="Hyperlink"/>
+          </w:rPr>
+          <w:t xml:space="preserve">object-oriented systems</w:t>
+        </w:r>
+      </w:hyperlink>
+      <w:r>
+        <w:t xml:space="preserve">,</w:t>
+      </w:r>
+      <w:r>
+        <w:t xml:space="preserve"> </w:t>
+      </w:r>
+      <w:r>
+        <w:t xml:space="preserve">and</w:t>
+      </w:r>
+      <w:r>
+        <w:t xml:space="preserve"> </w:t>
+      </w:r>
+      <w:hyperlink r:id="rId352">
+        <w:r>
+          <w:rPr>
+            <w:rStyle w:val="Hyperlink"/>
+          </w:rPr>
+          <w:t xml:space="preserve">debugging</w:t>
+        </w:r>
+      </w:hyperlink>
+    </w:p>
+    <w:p>
+      <w:pPr>
+        <w:pStyle w:val="Compact"/>
+        <w:numPr>
+          <w:ilvl w:val="0"/>
+          <w:numId w:val="1078"/>
+        </w:numPr>
+      </w:pPr>
+      <w:hyperlink r:id="rId353">
+        <w:r>
+          <w:rPr>
+            <w:rStyle w:val="Hyperlink"/>
+          </w:rPr>
+          <w:t xml:space="preserve">Debugging R code</w:t>
+        </w:r>
+      </w:hyperlink>
+      <w:r>
+        <w:t xml:space="preserve"> </w:t>
+      </w:r>
+      <w:r>
+        <w:t xml:space="preserve">(Simon Wood) -</w:t>
+      </w:r>
+      <w:r>
+        <w:t xml:space="preserve"> </w:t>
+      </w:r>
+      <w:r>
+        <w:t xml:space="preserve">debugging R and compiled code called from R</w:t>
+      </w:r>
+    </w:p>
+    <w:p>
+      <w:pPr>
+        <w:pStyle w:val="Compact"/>
+        <w:numPr>
+          <w:ilvl w:val="0"/>
+          <w:numId w:val="1078"/>
+        </w:numPr>
+      </w:pPr>
+      <w:hyperlink r:id="rId354">
+        <w:r>
+          <w:rPr>
+            <w:rStyle w:val="Hyperlink"/>
+          </w:rPr>
+          <w:t xml:space="preserve">Differences between the base R and</w:t>
+        </w:r>
+        <w:r>
+          <w:rPr>
+            <w:rStyle w:val="Hyperlink"/>
+          </w:rPr>
+          <w:t xml:space="preserve"> </w:t>
+        </w:r>
+        <w:r>
+          <w:rPr>
+            <w:rStyle w:val="VerbatimChar"/>
+          </w:rPr>
+          <w:t xml:space="preserve">{magrittr}</w:t>
+        </w:r>
+        <w:r>
+          <w:rPr>
+            <w:rStyle w:val="Hyperlink"/>
+          </w:rPr>
+          <w:t xml:space="preserve"> </w:t>
+        </w:r>
+        <w:r>
+          <w:rPr>
+            <w:rStyle w:val="Hyperlink"/>
+          </w:rPr>
+          <w:t xml:space="preserve">pipes</w:t>
+        </w:r>
+      </w:hyperlink>
+      <w:r>
+        <w:t xml:space="preserve"> </w:t>
+      </w:r>
+      <w:r>
+        <w:t xml:space="preserve">- how</w:t>
+      </w:r>
+      <w:r>
+        <w:t xml:space="preserve"> </w:t>
+      </w:r>
+      <w:r>
+        <w:rPr>
+          <w:rStyle w:val="VerbatimChar"/>
+        </w:rPr>
+        <w:t xml:space="preserve">|&gt;</w:t>
+      </w:r>
+      <w:r>
+        <w:t xml:space="preserve"> </w:t>
+      </w:r>
+      <w:r>
+        <w:t xml:space="preserve">and</w:t>
+      </w:r>
+      <w:r>
+        <w:t xml:space="preserve"> </w:t>
+      </w:r>
+      <w:r>
+        <w:rPr>
+          <w:rStyle w:val="VerbatimChar"/>
+        </w:rPr>
+        <w:t xml:space="preserve">%&gt;%</w:t>
+      </w:r>
+      <w:r>
+        <w:t xml:space="preserve"> </w:t>
+      </w:r>
+      <w:r>
+        <w:t xml:space="preserve">behave differently</w:t>
+      </w:r>
+    </w:p>
+    <w:p>
+      <w:pPr>
+        <w:pStyle w:val="Compact"/>
+        <w:numPr>
+          <w:ilvl w:val="0"/>
+          <w:numId w:val="1078"/>
+        </w:numPr>
+      </w:pPr>
+      <w:hyperlink r:id="rId355">
+        <w:r>
+          <w:rPr>
+            <w:rStyle w:val="Hyperlink"/>
+          </w:rPr>
+          <w:t xml:space="preserve">Spatial Data Science: With Applications in R</w:t>
+        </w:r>
+      </w:hyperlink>
+      <w:r>
+        <w:t xml:space="preserve"> </w:t>
+      </w:r>
+      <w:r>
+        <w:t xml:space="preserve">- spatial data analysis in R</w:t>
+      </w:r>
+    </w:p>
+    <w:bookmarkEnd w:id="356"/>
+    <w:bookmarkStart w:id="359" w:name="summary-tables"/>
+    <w:p>
+      <w:pPr>
+        <w:pStyle w:val="Heading3"/>
+      </w:pPr>
+      <w:r>
+        <w:t xml:space="preserve">47.4 Summary tables</w:t>
+      </w:r>
+    </w:p>
+    <w:p>
+      <w:pPr>
+        <w:pStyle w:val="Compact"/>
+        <w:numPr>
+          <w:ilvl w:val="0"/>
+          <w:numId w:val="1079"/>
+        </w:numPr>
+      </w:pPr>
+      <w:hyperlink r:id="rId137">
+        <w:r>
+          <w:rPr>
+            <w:rStyle w:val="VerbatimChar"/>
+          </w:rPr>
+          <w:t xml:space="preserve">{gtsummary}</w:t>
+        </w:r>
+      </w:hyperlink>
+      <w:r>
+        <w:t xml:space="preserve"> </w:t>
+      </w:r>
+      <w:r>
+        <w:t xml:space="preserve">- flexible demographics and summary tables; start here</w:t>
+      </w:r>
+    </w:p>
+    <w:p>
+      <w:pPr>
+        <w:pStyle w:val="Compact"/>
+        <w:numPr>
+          <w:ilvl w:val="0"/>
+          <w:numId w:val="1079"/>
+        </w:numPr>
+      </w:pPr>
+      <w:hyperlink r:id="rId357">
+        <w:r>
+          <w:rPr>
+            <w:rStyle w:val="VerbatimChar"/>
+          </w:rPr>
+          <w:t xml:space="preserve">{table1}</w:t>
+        </w:r>
+      </w:hyperlink>
+      <w:r>
+        <w:t xml:space="preserve"> </w:t>
+      </w:r>
+      <w:r>
+        <w:t xml:space="preserve">- HTML</w:t>
+      </w:r>
+      <w:r>
+        <w:t xml:space="preserve"> </w:t>
+      </w:r>
+      <w:r>
+        <w:t xml:space="preserve">“Table 1”</w:t>
+      </w:r>
+      <w:r>
+        <w:t xml:space="preserve"> </w:t>
+      </w:r>
+      <w:r>
+        <w:t xml:space="preserve">demographics tables</w:t>
+      </w:r>
+    </w:p>
+    <w:p>
+      <w:pPr>
+        <w:pStyle w:val="Compact"/>
+        <w:numPr>
+          <w:ilvl w:val="0"/>
+          <w:numId w:val="1079"/>
+        </w:numPr>
+      </w:pPr>
+      <w:hyperlink r:id="rId358">
+        <w:r>
+          <w:rPr>
+            <w:rStyle w:val="VerbatimChar"/>
+          </w:rPr>
+          <w:t xml:space="preserve">{arsenal}</w:t>
+        </w:r>
+      </w:hyperlink>
+      <w:r>
+        <w:t xml:space="preserve"> </w:t>
+      </w:r>
+      <w:r>
+        <w:t xml:space="preserve">- summary tables, from the Mayo Clinic</w:t>
+      </w:r>
+    </w:p>
+    <w:p>
+      <w:pPr>
+        <w:pStyle w:val="Compact"/>
+        <w:numPr>
+          <w:ilvl w:val="0"/>
+          <w:numId w:val="1079"/>
+        </w:numPr>
+      </w:pPr>
+      <w:r>
+        <w:rPr>
+          <w:rStyle w:val="VerbatimChar"/>
+        </w:rPr>
+        <w:t xml:space="preserve">{procs}</w:t>
+      </w:r>
+      <w:r>
+        <w:t xml:space="preserve"> </w:t>
+      </w:r>
+      <w:r>
+        <w:t xml:space="preserve">(under</w:t>
+      </w:r>
+      <w:r>
+        <w:t xml:space="preserve"> </w:t>
+      </w:r>
+      <w:r>
+        <w:t xml:space="preserve">“Coming to R from SAS”</w:t>
+      </w:r>
+      <w:r>
+        <w:t xml:space="preserve"> </w:t>
+      </w:r>
+      <w:r>
+        <w:t xml:space="preserve">above) - SAS-style frequency and means tables</w:t>
+      </w:r>
+    </w:p>
+    <w:bookmarkEnd w:id="359"/>
+    <w:bookmarkStart w:id="364" w:name="r-package-development"/>
+    <w:p>
+      <w:pPr>
+        <w:pStyle w:val="Heading3"/>
+      </w:pPr>
+      <w:r>
+        <w:t xml:space="preserve">47.5 R Package Development</w:t>
+      </w:r>
+    </w:p>
+    <w:p>
+      <w:pPr>
+        <w:pStyle w:val="Compact"/>
+        <w:numPr>
+          <w:ilvl w:val="0"/>
+          <w:numId w:val="1080"/>
+        </w:numPr>
+      </w:pPr>
+      <w:r>
+        <w:t xml:space="preserve">R Packages</w:t>
+      </w:r>
+      <w:r>
+        <w:t xml:space="preserve"> </w:t>
+      </w:r>
+      <w:r>
+        <w:t xml:space="preserve">(Wickham and Bryan 2023)</w:t>
+      </w:r>
+      <w:r>
+        <w:t xml:space="preserve"> </w:t>
+      </w:r>
+      <w:r>
+        <w:t xml:space="preserve">- comprehensive guide to R package development</w:t>
+      </w:r>
+    </w:p>
+    <w:p>
+      <w:pPr>
+        <w:pStyle w:val="Compact"/>
+        <w:numPr>
+          <w:ilvl w:val="0"/>
+          <w:numId w:val="1080"/>
+        </w:numPr>
+      </w:pPr>
+      <w:r>
+        <w:t xml:space="preserve">Tidyverse design guide</w:t>
+      </w:r>
+      <w:r>
+        <w:t xml:space="preserve"> </w:t>
+      </w:r>
+      <w:r>
+        <w:t xml:space="preserve">(Wickham 2023)</w:t>
+      </w:r>
+      <w:r>
+        <w:t xml:space="preserve"> </w:t>
+      </w:r>
+      <w:r>
+        <w:t xml:space="preserve">- principles for designing R packages and APIs that are intuitive, composable, and consistent with tidyverse philosophy</w:t>
+      </w:r>
+    </w:p>
+    <w:p>
+      <w:pPr>
+        <w:pStyle w:val="Compact"/>
+        <w:numPr>
+          <w:ilvl w:val="0"/>
+          <w:numId w:val="1080"/>
         </w:numPr>
       </w:pPr>
       <w:hyperlink r:id="rId36">
@@ -39221,7 +39896,7 @@
         <w:pStyle w:val="Compact"/>
         <w:numPr>
           <w:ilvl w:val="0"/>
-          <w:numId w:val="1076"/>
+          <w:numId w:val="1080"/>
         </w:numPr>
       </w:pPr>
       <w:hyperlink r:id="rId37">
@@ -39244,7 +39919,7 @@
         <w:pStyle w:val="Compact"/>
         <w:numPr>
           <w:ilvl w:val="0"/>
-          <w:numId w:val="1076"/>
+          <w:numId w:val="1080"/>
         </w:numPr>
       </w:pPr>
       <w:hyperlink r:id="rId23">
@@ -39267,7 +39942,7 @@
         <w:pStyle w:val="Compact"/>
         <w:numPr>
           <w:ilvl w:val="0"/>
-          <w:numId w:val="1076"/>
+          <w:numId w:val="1080"/>
         </w:numPr>
       </w:pPr>
       <w:hyperlink r:id="rId39">
@@ -39285,38 +39960,64 @@
         <w:t xml:space="preserve">- unit testing framework</w:t>
       </w:r>
     </w:p>
-    <w:bookmarkEnd w:id="338"/>
-    <w:bookmarkStart w:id="339" w:name="general-r-programming"/>
-    <w:p>
-      <w:pPr>
-        <w:pStyle w:val="Heading3"/>
-      </w:pPr>
-      <w:r>
-        <w:t xml:space="preserve">47.2 General R Programming</w:t>
-      </w:r>
-    </w:p>
     <w:p>
       <w:pPr>
         <w:pStyle w:val="Compact"/>
         <w:numPr>
           <w:ilvl w:val="0"/>
-          <w:numId w:val="1077"/>
+          <w:numId w:val="1080"/>
         </w:numPr>
       </w:pPr>
-      <w:r>
-        <w:t xml:space="preserve">R for Data Science</w:t>
-      </w:r>
-      <w:r>
-        <w:t xml:space="preserve"> </w:t>
-      </w:r>
-      <w:r>
-        <w:t xml:space="preserve">(Wickham et al. 2023)</w:t>
-      </w:r>
-      <w:r>
-        <w:t xml:space="preserve"> </w:t>
-      </w:r>
-      <w:r>
-        <w:t xml:space="preserve">- learn data science with the tidyverse</w:t>
+      <w:hyperlink r:id="rId360">
+        <w:r>
+          <w:rPr>
+            <w:rStyle w:val="Hyperlink"/>
+          </w:rPr>
+          <w:t xml:space="preserve">Releasing to CRAN</w:t>
+        </w:r>
+      </w:hyperlink>
+      <w:r>
+        <w:t xml:space="preserve"> </w:t>
+      </w:r>
+      <w:r>
+        <w:t xml:space="preserve">and the</w:t>
+      </w:r>
+      <w:r>
+        <w:t xml:space="preserve"> </w:t>
+      </w:r>
+      <w:hyperlink r:id="rId361">
+        <w:r>
+          <w:rPr>
+            <w:rStyle w:val="Hyperlink"/>
+          </w:rPr>
+          <w:t xml:space="preserve">CRAN Cookbook</w:t>
+        </w:r>
+      </w:hyperlink>
+      <w:r>
+        <w:t xml:space="preserve"> </w:t>
+      </w:r>
+      <w:r>
+        <w:t xml:space="preserve">- preparing a CRAN submission</w:t>
+      </w:r>
+      <w:r>
+        <w:t xml:space="preserve"> </w:t>
+      </w:r>
+      <w:r>
+        <w:t xml:space="preserve">(see also</w:t>
+      </w:r>
+      <w:r>
+        <w:t xml:space="preserve"> </w:t>
+      </w:r>
+      <w:hyperlink r:id="rId362">
+        <w:r>
+          <w:rPr>
+            <w:rStyle w:val="Hyperlink"/>
+          </w:rPr>
+          <w:t xml:space="preserve">Code Publication</w:t>
+        </w:r>
+      </w:hyperlink>
+      <w:r>
+        <w:t xml:space="preserve">)</w:t>
       </w:r>
     </w:p>
     <w:p>
@@ -39324,33 +40025,32 @@
         <w:pStyle w:val="Compact"/>
         <w:numPr>
           <w:ilvl w:val="0"/>
-          <w:numId w:val="1077"/>
+          <w:numId w:val="1080"/>
         </w:numPr>
       </w:pPr>
-      <w:r>
-        <w:t xml:space="preserve">Advanced R</w:t>
-      </w:r>
-      <w:r>
-        <w:t xml:space="preserve"> </w:t>
-      </w:r>
-      <w:r>
-        <w:t xml:space="preserve">(Wickham 2019)</w:t>
-      </w:r>
-      <w:r>
-        <w:t xml:space="preserve"> </w:t>
-      </w:r>
-      <w:r>
-        <w:t xml:space="preserve">- deep dive into R programming and internals</w:t>
-      </w:r>
-    </w:p>
-    <w:bookmarkEnd w:id="339"/>
-    <w:bookmarkStart w:id="340" w:name="shiny-development"/>
+      <w:hyperlink r:id="rId363">
+        <w:r>
+          <w:rPr>
+            <w:rStyle w:val="Hyperlink"/>
+          </w:rPr>
+          <w:t xml:space="preserve">Contributing to R</w:t>
+        </w:r>
+      </w:hyperlink>
+      <w:r>
+        <w:t xml:space="preserve"> </w:t>
+      </w:r>
+      <w:r>
+        <w:t xml:space="preserve">- getting involved with base R itself</w:t>
+      </w:r>
+    </w:p>
+    <w:bookmarkEnd w:id="364"/>
+    <w:bookmarkStart w:id="365" w:name="shiny-development"/>
     <w:p>
       <w:pPr>
         <w:pStyle w:val="Heading3"/>
       </w:pPr>
       <w:r>
-        <w:t xml:space="preserve">47.3 Shiny Development</w:t>
+        <w:t xml:space="preserve">47.6 Shiny Development</w:t>
       </w:r>
     </w:p>
     <w:p>
@@ -39358,7 +40058,7 @@
         <w:pStyle w:val="Compact"/>
         <w:numPr>
           <w:ilvl w:val="0"/>
-          <w:numId w:val="1078"/>
+          <w:numId w:val="1081"/>
         </w:numPr>
       </w:pPr>
       <w:r>
@@ -39382,7 +40082,7 @@
         <w:pStyle w:val="Compact"/>
         <w:numPr>
           <w:ilvl w:val="0"/>
-          <w:numId w:val="1078"/>
+          <w:numId w:val="1081"/>
         </w:numPr>
       </w:pPr>
       <w:r>
@@ -39401,14 +40101,14 @@
         <w:t xml:space="preserve">- best practices for production Shiny applications</w:t>
       </w:r>
     </w:p>
-    <w:bookmarkEnd w:id="340"/>
-    <w:bookmarkStart w:id="359" w:name="git-and-version-control"/>
+    <w:bookmarkEnd w:id="365"/>
+    <w:bookmarkStart w:id="388" w:name="git-and-version-control"/>
     <w:p>
       <w:pPr>
         <w:pStyle w:val="Heading3"/>
       </w:pPr>
       <w:r>
-        <w:t xml:space="preserve">47.4 Git and Version Control</w:t>
+        <w:t xml:space="preserve">47.7 Git and Version Control</w:t>
       </w:r>
     </w:p>
     <w:p>
@@ -39416,7 +40116,7 @@
         <w:pStyle w:val="Compact"/>
         <w:numPr>
           <w:ilvl w:val="0"/>
-          <w:numId w:val="1079"/>
+          <w:numId w:val="1082"/>
         </w:numPr>
       </w:pPr>
       <w:r>
@@ -39440,10 +40140,129 @@
         <w:pStyle w:val="Compact"/>
         <w:numPr>
           <w:ilvl w:val="0"/>
-          <w:numId w:val="1079"/>
+          <w:numId w:val="1082"/>
         </w:numPr>
       </w:pPr>
-      <w:hyperlink r:id="rId341">
+      <w:hyperlink r:id="rId366">
+        <w:r>
+          <w:rPr>
+            <w:rStyle w:val="Hyperlink"/>
+          </w:rPr>
+          <w:t xml:space="preserve">Pull request helpers in</w:t>
+        </w:r>
+        <w:r>
+          <w:rPr>
+            <w:rStyle w:val="Hyperlink"/>
+          </w:rPr>
+          <w:t xml:space="preserve"> </w:t>
+        </w:r>
+        <w:r>
+          <w:rPr>
+            <w:rStyle w:val="VerbatimChar"/>
+          </w:rPr>
+          <w:t xml:space="preserve">{usethis}</w:t>
+        </w:r>
+      </w:hyperlink>
+      <w:r>
+        <w:t xml:space="preserve"> </w:t>
+      </w:r>
+      <w:r>
+        <w:t xml:space="preserve">- the</w:t>
+      </w:r>
+      <w:r>
+        <w:t xml:space="preserve"> </w:t>
+      </w:r>
+      <w:r>
+        <w:rPr>
+          <w:rStyle w:val="VerbatimChar"/>
+        </w:rPr>
+        <w:t xml:space="preserve">pr_*()</w:t>
+      </w:r>
+      <w:r>
+        <w:t xml:space="preserve"> </w:t>
+      </w:r>
+      <w:r>
+        <w:t xml:space="preserve">workflow from R</w:t>
+      </w:r>
+    </w:p>
+    <w:p>
+      <w:pPr>
+        <w:pStyle w:val="Compact"/>
+        <w:numPr>
+          <w:ilvl w:val="0"/>
+          <w:numId w:val="1082"/>
+        </w:numPr>
+      </w:pPr>
+      <w:hyperlink r:id="rId367">
+        <w:r>
+          <w:rPr>
+            <w:rStyle w:val="Hyperlink"/>
+          </w:rPr>
+          <w:t xml:space="preserve">Oh Shit, Git!?!</w:t>
+        </w:r>
+      </w:hyperlink>
+      <w:r>
+        <w:t xml:space="preserve"> </w:t>
+      </w:r>
+      <w:r>
+        <w:t xml:space="preserve">- plain-language fixes for common Git mistakes</w:t>
+      </w:r>
+    </w:p>
+    <w:p>
+      <w:pPr>
+        <w:pStyle w:val="Compact"/>
+        <w:numPr>
+          <w:ilvl w:val="0"/>
+          <w:numId w:val="1082"/>
+        </w:numPr>
+      </w:pPr>
+      <w:hyperlink r:id="rId368">
+        <w:r>
+          <w:rPr>
+            <w:rStyle w:val="VerbatimChar"/>
+          </w:rPr>
+          <w:t xml:space="preserve">{saperlipopette}</w:t>
+        </w:r>
+      </w:hyperlink>
+      <w:r>
+        <w:t xml:space="preserve"> </w:t>
+      </w:r>
+      <w:r>
+        <w:t xml:space="preserve">- practice Git rescue exercises from R</w:t>
+      </w:r>
+    </w:p>
+    <w:p>
+      <w:pPr>
+        <w:pStyle w:val="Compact"/>
+        <w:numPr>
+          <w:ilvl w:val="0"/>
+          <w:numId w:val="1082"/>
+        </w:numPr>
+      </w:pPr>
+      <w:hyperlink r:id="rId369">
+        <w:r>
+          <w:rPr>
+            <w:rStyle w:val="Hyperlink"/>
+          </w:rPr>
+          <w:t xml:space="preserve">Git Magic</w:t>
+        </w:r>
+      </w:hyperlink>
+      <w:r>
+        <w:t xml:space="preserve"> </w:t>
+      </w:r>
+      <w:r>
+        <w:t xml:space="preserve">- a short, free Git book</w:t>
+      </w:r>
+    </w:p>
+    <w:p>
+      <w:pPr>
+        <w:pStyle w:val="Compact"/>
+        <w:numPr>
+          <w:ilvl w:val="0"/>
+          <w:numId w:val="1082"/>
+        </w:numPr>
+      </w:pPr>
+      <w:hyperlink r:id="rId370">
         <w:r>
           <w:rPr>
             <w:rStyle w:val="VerbatimChar"/>
@@ -39464,8 +40283,8 @@
         <w:t xml:space="preserve">organized by patterns like tags or issues</w:t>
       </w:r>
     </w:p>
-    <w:bookmarkStart w:id="358" w:name="refs"/>
-    <w:bookmarkStart w:id="343" w:name="ref-bryan2023happygit"/>
+    <w:bookmarkStart w:id="387" w:name="refs"/>
+    <w:bookmarkStart w:id="372" w:name="ref-bryan2023happygit"/>
     <w:p>
       <w:pPr>
         <w:pStyle w:val="Bibliography"/>
@@ -39489,7 +40308,7 @@
       <w:r>
         <w:t xml:space="preserve"> </w:t>
       </w:r>
-      <w:hyperlink r:id="rId342">
+      <w:hyperlink r:id="rId371">
         <w:r>
           <w:rPr>
             <w:rStyle w:val="Hyperlink"/>
@@ -39501,8 +40320,8 @@
         <w:t xml:space="preserve">.</w:t>
       </w:r>
     </w:p>
-    <w:bookmarkEnd w:id="343"/>
-    <w:bookmarkStart w:id="344" w:name="ref-reprex"/>
+    <w:bookmarkEnd w:id="372"/>
+    <w:bookmarkStart w:id="373" w:name="ref-reprex"/>
     <w:p>
       <w:pPr>
         <w:pStyle w:val="Bibliography"/>
@@ -39538,8 +40357,8 @@
         <w:t xml:space="preserve">.</w:t>
       </w:r>
     </w:p>
-    <w:bookmarkEnd w:id="344"/>
-    <w:bookmarkStart w:id="346" w:name="ref-fay2021engineering"/>
+    <w:bookmarkEnd w:id="373"/>
+    <w:bookmarkStart w:id="375" w:name="ref-fay2021engineering"/>
     <w:p>
       <w:pPr>
         <w:pStyle w:val="Bibliography"/>
@@ -39563,7 +40382,7 @@
       <w:r>
         <w:t xml:space="preserve"> </w:t>
       </w:r>
-      <w:hyperlink r:id="rId345">
+      <w:hyperlink r:id="rId374">
         <w:r>
           <w:rPr>
             <w:rStyle w:val="Hyperlink"/>
@@ -39575,8 +40394,8 @@
         <w:t xml:space="preserve">.</w:t>
       </w:r>
     </w:p>
-    <w:bookmarkEnd w:id="346"/>
-    <w:bookmarkStart w:id="348" w:name="ref-wickham2019advr"/>
+    <w:bookmarkEnd w:id="375"/>
+    <w:bookmarkStart w:id="377" w:name="ref-wickham2019advr"/>
     <w:p>
       <w:pPr>
         <w:pStyle w:val="Bibliography"/>
@@ -39600,7 +40419,7 @@
       <w:r>
         <w:t xml:space="preserve"> </w:t>
       </w:r>
-      <w:hyperlink r:id="rId347">
+      <w:hyperlink r:id="rId376">
         <w:r>
           <w:rPr>
             <w:rStyle w:val="Hyperlink"/>
@@ -39612,8 +40431,8 @@
         <w:t xml:space="preserve">.</w:t>
       </w:r>
     </w:p>
-    <w:bookmarkEnd w:id="348"/>
-    <w:bookmarkStart w:id="350" w:name="ref-wickham2021shiny"/>
+    <w:bookmarkEnd w:id="377"/>
+    <w:bookmarkStart w:id="379" w:name="ref-wickham2021shiny"/>
     <w:p>
       <w:pPr>
         <w:pStyle w:val="Bibliography"/>
@@ -39637,7 +40456,7 @@
       <w:r>
         <w:t xml:space="preserve"> </w:t>
       </w:r>
-      <w:hyperlink r:id="rId349">
+      <w:hyperlink r:id="rId378">
         <w:r>
           <w:rPr>
             <w:rStyle w:val="Hyperlink"/>
@@ -39649,8 +40468,8 @@
         <w:t xml:space="preserve">.</w:t>
       </w:r>
     </w:p>
-    <w:bookmarkEnd w:id="350"/>
-    <w:bookmarkStart w:id="352" w:name="ref-wickham2023tidydesign"/>
+    <w:bookmarkEnd w:id="379"/>
+    <w:bookmarkStart w:id="381" w:name="ref-wickham2023tidydesign"/>
     <w:p>
       <w:pPr>
         <w:pStyle w:val="Bibliography"/>
@@ -39674,7 +40493,7 @@
       <w:r>
         <w:t xml:space="preserve"> </w:t>
       </w:r>
-      <w:hyperlink r:id="rId351">
+      <w:hyperlink r:id="rId380">
         <w:r>
           <w:rPr>
             <w:rStyle w:val="Hyperlink"/>
@@ -39686,8 +40505,8 @@
         <w:t xml:space="preserve">.</w:t>
       </w:r>
     </w:p>
-    <w:bookmarkEnd w:id="352"/>
-    <w:bookmarkStart w:id="354" w:name="ref-wickham2023rpkgs"/>
+    <w:bookmarkEnd w:id="381"/>
+    <w:bookmarkStart w:id="383" w:name="ref-wickham2023rpkgs"/>
     <w:p>
       <w:pPr>
         <w:pStyle w:val="Bibliography"/>
@@ -39711,7 +40530,7 @@
       <w:r>
         <w:t xml:space="preserve"> </w:t>
       </w:r>
-      <w:hyperlink r:id="rId353">
+      <w:hyperlink r:id="rId382">
         <w:r>
           <w:rPr>
             <w:rStyle w:val="Hyperlink"/>
@@ -39723,8 +40542,8 @@
         <w:t xml:space="preserve">.</w:t>
       </w:r>
     </w:p>
-    <w:bookmarkEnd w:id="354"/>
-    <w:bookmarkStart w:id="356" w:name="ref-wickham2023r4ds"/>
+    <w:bookmarkEnd w:id="383"/>
+    <w:bookmarkStart w:id="385" w:name="ref-wickham2023r4ds"/>
     <w:p>
       <w:pPr>
         <w:pStyle w:val="Bibliography"/>
@@ -39748,7 +40567,7 @@
       <w:r>
         <w:t xml:space="preserve"> </w:t>
       </w:r>
-      <w:hyperlink r:id="rId355">
+      <w:hyperlink r:id="rId384">
         <w:r>
           <w:rPr>
             <w:rStyle w:val="Hyperlink"/>
@@ -39760,8 +40579,8 @@
         <w:t xml:space="preserve">.</w:t>
       </w:r>
     </w:p>
-    <w:bookmarkEnd w:id="356"/>
-    <w:bookmarkStart w:id="357" w:name="ref-R-roxygen2"/>
+    <w:bookmarkEnd w:id="385"/>
+    <w:bookmarkStart w:id="386" w:name="ref-R-roxygen2"/>
     <w:p>
       <w:pPr>
         <w:pStyle w:val="Bibliography"/>
@@ -39797,10 +40616,10 @@
         <w:t xml:space="preserve">.</w:t>
       </w:r>
     </w:p>
-    <w:bookmarkEnd w:id="357"/>
-    <w:bookmarkEnd w:id="358"/>
-    <w:bookmarkEnd w:id="359"/>
-    <w:bookmarkEnd w:id="360"/>
+    <w:bookmarkEnd w:id="386"/>
+    <w:bookmarkEnd w:id="387"/>
+    <w:bookmarkEnd w:id="388"/>
+    <w:bookmarkEnd w:id="389"/>
     <w:sectPr>
       <w:footnotePr>
         <w:numRestart w:val="eachSect"/>
@@ -40687,6 +41506,15 @@
     <w:abstractNumId w:val="991"/>
   </w:num>
   <w:num w:numId="1079">
+    <w:abstractNumId w:val="991"/>
+  </w:num>
+  <w:num w:numId="1080">
+    <w:abstractNumId w:val="991"/>
+  </w:num>
+  <w:num w:numId="1081">
+    <w:abstractNumId w:val="991"/>
+  </w:num>
+  <w:num w:numId="1082">
     <w:abstractNumId w:val="991"/>
   </w:num>
 </w:numbering>

</xml_diff>

<commit_message>
Deploying to gh-pages from @ Morrison-Lab/psc@3d92ab2bb1115231ebee5ef071e2f4669b160945 🚀
</commit_message>
<xml_diff>
--- a/chapters/coding-practices.docx
+++ b/chapters/coding-practices.docx
@@ -15,7 +15,7 @@
         <w:pStyle w:val="Date"/>
       </w:pPr>
       <w:r>
-        <w:t xml:space="preserve">Last modified: 2026-10-14 04:15:39 (PDT)</w:t>
+        <w:t xml:space="preserve">Last modified: 2026-10-14 12:29:23 (PDT)</w:t>
       </w:r>
     </w:p>
     <w:p>
@@ -523,7 +523,7 @@
         <w:t xml:space="preserve"> </w:t>
       </w:r>
       <w:r>
-        <w:t xml:space="preserve">the UCD-SERG lab manual’s</w:t>
+        <w:t xml:space="preserve">the</w:t>
       </w:r>
       <w:r>
         <w:t xml:space="preserve"> </w:t>
@@ -540,7 +540,19 @@
         <w:t xml:space="preserve"> </w:t>
       </w:r>
       <w:r>
-        <w:t xml:space="preserve">linter package packages a shared lint configuration,</w:t>
+        <w:t xml:space="preserve">linter package,</w:t>
+      </w:r>
+      <w:r>
+        <w:t xml:space="preserve"> </w:t>
+      </w:r>
+      <w:r>
+        <w:t xml:space="preserve">written for the UCD-SERG lab manual and now kept in this guide’s repository,</w:t>
+      </w:r>
+      <w:r>
+        <w:t xml:space="preserve"> </w:t>
+      </w:r>
+      <w:r>
+        <w:t xml:space="preserve">packages a shared lint configuration,</w:t>
       </w:r>
       <w:r>
         <w:t xml:space="preserve"> </w:t>

</xml_diff>

<commit_message>
Deploying to gh-pages from @ Morrison-Lab/psc@658b898684bf976e3ddc6d3a17d3c1e478f8b9c9 🚀
</commit_message>
<xml_diff>
--- a/chapters/coding-practices.docx
+++ b/chapters/coding-practices.docx
@@ -15,7 +15,7 @@
         <w:pStyle w:val="Date"/>
       </w:pPr>
       <w:r>
-        <w:t xml:space="preserve">Last modified: 2026-10-15 20:34:27 (PDT)</w:t>
+        <w:t xml:space="preserve">Last modified: 2026-10-15 21:20:53 (PDT)</w:t>
       </w:r>
     </w:p>
     <w:p>
@@ -39376,7 +39376,7 @@
       </w:r>
     </w:p>
     <w:bookmarkEnd w:id="336"/>
-    <w:bookmarkStart w:id="388" w:name="sec-r-resources"/>
+    <w:bookmarkStart w:id="390" w:name="sec-r-resources"/>
     <w:p>
       <w:pPr>
         <w:pStyle w:val="Heading2"/>
@@ -39572,13 +39572,13 @@
       </w:r>
     </w:p>
     <w:bookmarkEnd w:id="343"/>
-    <w:bookmarkStart w:id="348" w:name="coming-to-r-from-sas"/>
+    <w:bookmarkStart w:id="345" w:name="learning-python"/>
     <w:p>
       <w:pPr>
         <w:pStyle w:val="Heading3"/>
       </w:pPr>
       <w:r>
-        <w:t xml:space="preserve">46.2 Coming to R from SAS</w:t>
+        <w:t xml:space="preserve">46.2 Learning Python</w:t>
       </w:r>
     </w:p>
     <w:p>
@@ -39590,6 +39590,51 @@
         </w:numPr>
       </w:pPr>
       <w:hyperlink r:id="rId344">
+        <w:r>
+          <w:rPr>
+            <w:rStyle w:val="Hyperlink"/>
+          </w:rPr>
+          <w:t xml:space="preserve">Python Tutor</w:t>
+        </w:r>
+      </w:hyperlink>
+      <w:r>
+        <w:t xml:space="preserve"> </w:t>
+      </w:r>
+      <w:r>
+        <w:t xml:space="preserve">- steps through a short program one line at a time</w:t>
+      </w:r>
+      <w:r>
+        <w:t xml:space="preserve"> </w:t>
+      </w:r>
+      <w:r>
+        <w:t xml:space="preserve">and draws each variable and object in memory;</w:t>
+      </w:r>
+      <w:r>
+        <w:t xml:space="preserve"> </w:t>
+      </w:r>
+      <w:r>
+        <w:t xml:space="preserve">it visualizes Python, Java, C, C++ and JavaScript (not R) and limits program length, so use it on small examples</w:t>
+      </w:r>
+    </w:p>
+    <w:bookmarkEnd w:id="345"/>
+    <w:bookmarkStart w:id="350" w:name="coming-to-r-from-sas"/>
+    <w:p>
+      <w:pPr>
+        <w:pStyle w:val="Heading3"/>
+      </w:pPr>
+      <w:r>
+        <w:t xml:space="preserve">46.3 Coming to R from SAS</w:t>
+      </w:r>
+    </w:p>
+    <w:p>
+      <w:pPr>
+        <w:pStyle w:val="Compact"/>
+        <w:numPr>
+          <w:ilvl w:val="0"/>
+          <w:numId w:val="1078"/>
+        </w:numPr>
+      </w:pPr>
+      <w:hyperlink r:id="rId346">
         <w:r>
           <w:rPr>
             <w:rStyle w:val="Hyperlink"/>
@@ -39612,7 +39657,7 @@
       <w:r>
         <w:t xml:space="preserve"> </w:t>
       </w:r>
-      <w:hyperlink r:id="rId345">
+      <w:hyperlink r:id="rId347">
         <w:r>
           <w:rPr>
             <w:rStyle w:val="VerbatimChar"/>
@@ -39686,10 +39731,10 @@
         <w:pStyle w:val="Compact"/>
         <w:numPr>
           <w:ilvl w:val="0"/>
-          <w:numId w:val="1077"/>
+          <w:numId w:val="1078"/>
         </w:numPr>
       </w:pPr>
-      <w:hyperlink r:id="rId346">
+      <w:hyperlink r:id="rId348">
         <w:r>
           <w:rPr>
             <w:rStyle w:val="Hyperlink"/>
@@ -39709,10 +39754,10 @@
         <w:pStyle w:val="Compact"/>
         <w:numPr>
           <w:ilvl w:val="0"/>
-          <w:numId w:val="1077"/>
+          <w:numId w:val="1078"/>
         </w:numPr>
       </w:pPr>
-      <w:hyperlink r:id="rId347">
+      <w:hyperlink r:id="rId349">
         <w:r>
           <w:rPr>
             <w:rStyle w:val="Hyperlink"/>
@@ -39727,14 +39772,14 @@
         <w:t xml:space="preserve">(Kleinman and Horton) - side-by-side SAS and R code for data management and analysis</w:t>
       </w:r>
     </w:p>
-    <w:bookmarkEnd w:id="348"/>
-    <w:bookmarkStart w:id="355" w:name="general-r-programming"/>
+    <w:bookmarkEnd w:id="350"/>
+    <w:bookmarkStart w:id="357" w:name="general-r-programming"/>
     <w:p>
       <w:pPr>
         <w:pStyle w:val="Heading3"/>
       </w:pPr>
       <w:r>
-        <w:t xml:space="preserve">46.3 General R Programming</w:t>
+        <w:t xml:space="preserve">46.4 General R Programming</w:t>
       </w:r>
     </w:p>
     <w:p>
@@ -39742,7 +39787,7 @@
         <w:pStyle w:val="Compact"/>
         <w:numPr>
           <w:ilvl w:val="0"/>
-          <w:numId w:val="1078"/>
+          <w:numId w:val="1079"/>
         </w:numPr>
       </w:pPr>
       <w:r>
@@ -39763,7 +39808,7 @@
       <w:r>
         <w:t xml:space="preserve"> </w:t>
       </w:r>
-      <w:hyperlink r:id="rId349">
+      <w:hyperlink r:id="rId351">
         <w:r>
           <w:rPr>
             <w:rStyle w:val="Hyperlink"/>
@@ -39777,7 +39822,7 @@
       <w:r>
         <w:t xml:space="preserve"> </w:t>
       </w:r>
-      <w:hyperlink r:id="rId350">
+      <w:hyperlink r:id="rId352">
         <w:r>
           <w:rPr>
             <w:rStyle w:val="Hyperlink"/>
@@ -39797,7 +39842,7 @@
       <w:r>
         <w:t xml:space="preserve"> </w:t>
       </w:r>
-      <w:hyperlink r:id="rId351">
+      <w:hyperlink r:id="rId353">
         <w:r>
           <w:rPr>
             <w:rStyle w:val="Hyperlink"/>
@@ -39811,10 +39856,10 @@
         <w:pStyle w:val="Compact"/>
         <w:numPr>
           <w:ilvl w:val="0"/>
-          <w:numId w:val="1078"/>
+          <w:numId w:val="1079"/>
         </w:numPr>
       </w:pPr>
-      <w:hyperlink r:id="rId352">
+      <w:hyperlink r:id="rId354">
         <w:r>
           <w:rPr>
             <w:rStyle w:val="Hyperlink"/>
@@ -39840,10 +39885,10 @@
         <w:pStyle w:val="Compact"/>
         <w:numPr>
           <w:ilvl w:val="0"/>
-          <w:numId w:val="1078"/>
+          <w:numId w:val="1079"/>
         </w:numPr>
       </w:pPr>
-      <w:hyperlink r:id="rId353">
+      <w:hyperlink r:id="rId355">
         <w:r>
           <w:rPr>
             <w:rStyle w:val="Hyperlink"/>
@@ -39917,10 +39962,10 @@
         <w:pStyle w:val="Compact"/>
         <w:numPr>
           <w:ilvl w:val="0"/>
-          <w:numId w:val="1078"/>
+          <w:numId w:val="1079"/>
         </w:numPr>
       </w:pPr>
-      <w:hyperlink r:id="rId354">
+      <w:hyperlink r:id="rId356">
         <w:r>
           <w:rPr>
             <w:rStyle w:val="Hyperlink"/>
@@ -39935,14 +39980,14 @@
         <w:t xml:space="preserve">- spatial data analysis in R</w:t>
       </w:r>
     </w:p>
-    <w:bookmarkEnd w:id="355"/>
-    <w:bookmarkStart w:id="358" w:name="summary-tables"/>
+    <w:bookmarkEnd w:id="357"/>
+    <w:bookmarkStart w:id="360" w:name="summary-tables"/>
     <w:p>
       <w:pPr>
         <w:pStyle w:val="Heading3"/>
       </w:pPr>
       <w:r>
-        <w:t xml:space="preserve">46.4 Summary tables</w:t>
+        <w:t xml:space="preserve">46.5 Summary tables</w:t>
       </w:r>
     </w:p>
     <w:p>
@@ -39950,7 +39995,7 @@
         <w:pStyle w:val="Compact"/>
         <w:numPr>
           <w:ilvl w:val="0"/>
-          <w:numId w:val="1079"/>
+          <w:numId w:val="1080"/>
         </w:numPr>
       </w:pPr>
       <w:hyperlink r:id="rId140">
@@ -39973,10 +40018,10 @@
         <w:pStyle w:val="Compact"/>
         <w:numPr>
           <w:ilvl w:val="0"/>
-          <w:numId w:val="1079"/>
+          <w:numId w:val="1080"/>
         </w:numPr>
       </w:pPr>
-      <w:hyperlink r:id="rId356">
+      <w:hyperlink r:id="rId358">
         <w:r>
           <w:rPr>
             <w:rStyle w:val="VerbatimChar"/>
@@ -40008,10 +40053,10 @@
         <w:pStyle w:val="Compact"/>
         <w:numPr>
           <w:ilvl w:val="0"/>
-          <w:numId w:val="1079"/>
+          <w:numId w:val="1080"/>
         </w:numPr>
       </w:pPr>
-      <w:hyperlink r:id="rId357">
+      <w:hyperlink r:id="rId359">
         <w:r>
           <w:rPr>
             <w:rStyle w:val="VerbatimChar"/>
@@ -40031,7 +40076,7 @@
         <w:pStyle w:val="Compact"/>
         <w:numPr>
           <w:ilvl w:val="0"/>
-          <w:numId w:val="1079"/>
+          <w:numId w:val="1080"/>
         </w:numPr>
       </w:pPr>
       <w:r>
@@ -40059,14 +40104,14 @@
         <w:t xml:space="preserve">above) - SAS-style frequency and means tables</w:t>
       </w:r>
     </w:p>
-    <w:bookmarkEnd w:id="358"/>
-    <w:bookmarkStart w:id="363" w:name="r-package-development"/>
+    <w:bookmarkEnd w:id="360"/>
+    <w:bookmarkStart w:id="365" w:name="r-package-development"/>
     <w:p>
       <w:pPr>
         <w:pStyle w:val="Heading3"/>
       </w:pPr>
       <w:r>
-        <w:t xml:space="preserve">46.5 R Package Development</w:t>
+        <w:t xml:space="preserve">46.6 R Package Development</w:t>
       </w:r>
     </w:p>
     <w:p>
@@ -40074,7 +40119,7 @@
         <w:pStyle w:val="Compact"/>
         <w:numPr>
           <w:ilvl w:val="0"/>
-          <w:numId w:val="1080"/>
+          <w:numId w:val="1081"/>
         </w:numPr>
       </w:pPr>
       <w:r>
@@ -40098,7 +40143,7 @@
         <w:pStyle w:val="Compact"/>
         <w:numPr>
           <w:ilvl w:val="0"/>
-          <w:numId w:val="1080"/>
+          <w:numId w:val="1081"/>
         </w:numPr>
       </w:pPr>
       <w:r>
@@ -40122,7 +40167,7 @@
         <w:pStyle w:val="Compact"/>
         <w:numPr>
           <w:ilvl w:val="0"/>
-          <w:numId w:val="1080"/>
+          <w:numId w:val="1081"/>
         </w:numPr>
       </w:pPr>
       <w:hyperlink r:id="rId36">
@@ -40145,7 +40190,7 @@
         <w:pStyle w:val="Compact"/>
         <w:numPr>
           <w:ilvl w:val="0"/>
-          <w:numId w:val="1080"/>
+          <w:numId w:val="1081"/>
         </w:numPr>
       </w:pPr>
       <w:hyperlink r:id="rId37">
@@ -40168,7 +40213,7 @@
         <w:pStyle w:val="Compact"/>
         <w:numPr>
           <w:ilvl w:val="0"/>
-          <w:numId w:val="1080"/>
+          <w:numId w:val="1081"/>
         </w:numPr>
       </w:pPr>
       <w:hyperlink r:id="rId23">
@@ -40191,7 +40236,7 @@
         <w:pStyle w:val="Compact"/>
         <w:numPr>
           <w:ilvl w:val="0"/>
-          <w:numId w:val="1080"/>
+          <w:numId w:val="1081"/>
         </w:numPr>
       </w:pPr>
       <w:hyperlink r:id="rId39">
@@ -40214,10 +40259,10 @@
         <w:pStyle w:val="Compact"/>
         <w:numPr>
           <w:ilvl w:val="0"/>
-          <w:numId w:val="1080"/>
+          <w:numId w:val="1081"/>
         </w:numPr>
       </w:pPr>
-      <w:hyperlink r:id="rId359">
+      <w:hyperlink r:id="rId361">
         <w:r>
           <w:rPr>
             <w:rStyle w:val="Hyperlink"/>
@@ -40234,7 +40279,7 @@
       <w:r>
         <w:t xml:space="preserve"> </w:t>
       </w:r>
-      <w:hyperlink r:id="rId360">
+      <w:hyperlink r:id="rId362">
         <w:r>
           <w:rPr>
             <w:rStyle w:val="Hyperlink"/>
@@ -40257,7 +40302,7 @@
       <w:r>
         <w:t xml:space="preserve"> </w:t>
       </w:r>
-      <w:hyperlink r:id="rId361">
+      <w:hyperlink r:id="rId363">
         <w:r>
           <w:rPr>
             <w:rStyle w:val="Hyperlink"/>
@@ -40274,10 +40319,10 @@
         <w:pStyle w:val="Compact"/>
         <w:numPr>
           <w:ilvl w:val="0"/>
-          <w:numId w:val="1080"/>
+          <w:numId w:val="1081"/>
         </w:numPr>
       </w:pPr>
-      <w:hyperlink r:id="rId362">
+      <w:hyperlink r:id="rId364">
         <w:r>
           <w:rPr>
             <w:rStyle w:val="Hyperlink"/>
@@ -40292,72 +40337,14 @@
         <w:t xml:space="preserve">- getting involved with base R itself</w:t>
       </w:r>
     </w:p>
-    <w:bookmarkEnd w:id="363"/>
-    <w:bookmarkStart w:id="364" w:name="shiny-development"/>
+    <w:bookmarkEnd w:id="365"/>
+    <w:bookmarkStart w:id="366" w:name="shiny-development"/>
     <w:p>
       <w:pPr>
         <w:pStyle w:val="Heading3"/>
       </w:pPr>
       <w:r>
-        <w:t xml:space="preserve">46.6 Shiny Development</w:t>
-      </w:r>
-    </w:p>
-    <w:p>
-      <w:pPr>
-        <w:pStyle w:val="Compact"/>
-        <w:numPr>
-          <w:ilvl w:val="0"/>
-          <w:numId w:val="1081"/>
-        </w:numPr>
-      </w:pPr>
-      <w:r>
-        <w:t xml:space="preserve">Mastering Shiny</w:t>
-      </w:r>
-      <w:r>
-        <w:t xml:space="preserve"> </w:t>
-      </w:r>
-      <w:r>
-        <w:t xml:space="preserve">(Wickham 2021)</w:t>
-      </w:r>
-      <w:r>
-        <w:t xml:space="preserve"> </w:t>
-      </w:r>
-      <w:r>
-        <w:t xml:space="preserve">- comprehensive guide to building web applications with Shiny</w:t>
-      </w:r>
-    </w:p>
-    <w:p>
-      <w:pPr>
-        <w:pStyle w:val="Compact"/>
-        <w:numPr>
-          <w:ilvl w:val="0"/>
-          <w:numId w:val="1081"/>
-        </w:numPr>
-      </w:pPr>
-      <w:r>
-        <w:t xml:space="preserve">Engineering Production-Grade Shiny Apps</w:t>
-      </w:r>
-      <w:r>
-        <w:t xml:space="preserve"> </w:t>
-      </w:r>
-      <w:r>
-        <w:t xml:space="preserve">(Fay et al. 2021)</w:t>
-      </w:r>
-      <w:r>
-        <w:t xml:space="preserve"> </w:t>
-      </w:r>
-      <w:r>
-        <w:t xml:space="preserve">- best practices for production Shiny applications</w:t>
-      </w:r>
-    </w:p>
-    <w:bookmarkEnd w:id="364"/>
-    <w:bookmarkStart w:id="387" w:name="git-and-version-control"/>
-    <w:p>
-      <w:pPr>
-        <w:pStyle w:val="Heading3"/>
-      </w:pPr>
-      <w:r>
-        <w:t xml:space="preserve">46.7 Git and Version Control</w:t>
+        <w:t xml:space="preserve">46.7 Shiny Development</w:t>
       </w:r>
     </w:p>
     <w:p>
@@ -40369,19 +40356,19 @@
         </w:numPr>
       </w:pPr>
       <w:r>
-        <w:t xml:space="preserve">Happy Git and GitHub for the useR</w:t>
-      </w:r>
-      <w:r>
-        <w:t xml:space="preserve"> </w:t>
-      </w:r>
-      <w:r>
-        <w:t xml:space="preserve">(Bryan 2023)</w:t>
-      </w:r>
-      <w:r>
-        <w:t xml:space="preserve"> </w:t>
-      </w:r>
-      <w:r>
-        <w:t xml:space="preserve">- essential guide to using Git and GitHub with R</w:t>
+        <w:t xml:space="preserve">Mastering Shiny</w:t>
+      </w:r>
+      <w:r>
+        <w:t xml:space="preserve"> </w:t>
+      </w:r>
+      <w:r>
+        <w:t xml:space="preserve">(Wickham 2021)</w:t>
+      </w:r>
+      <w:r>
+        <w:t xml:space="preserve"> </w:t>
+      </w:r>
+      <w:r>
+        <w:t xml:space="preserve">- comprehensive guide to building web applications with Shiny</w:t>
       </w:r>
     </w:p>
     <w:p>
@@ -40392,7 +40379,65 @@
           <w:numId w:val="1082"/>
         </w:numPr>
       </w:pPr>
-      <w:hyperlink r:id="rId365">
+      <w:r>
+        <w:t xml:space="preserve">Engineering Production-Grade Shiny Apps</w:t>
+      </w:r>
+      <w:r>
+        <w:t xml:space="preserve"> </w:t>
+      </w:r>
+      <w:r>
+        <w:t xml:space="preserve">(Fay et al. 2021)</w:t>
+      </w:r>
+      <w:r>
+        <w:t xml:space="preserve"> </w:t>
+      </w:r>
+      <w:r>
+        <w:t xml:space="preserve">- best practices for production Shiny applications</w:t>
+      </w:r>
+    </w:p>
+    <w:bookmarkEnd w:id="366"/>
+    <w:bookmarkStart w:id="389" w:name="git-and-version-control"/>
+    <w:p>
+      <w:pPr>
+        <w:pStyle w:val="Heading3"/>
+      </w:pPr>
+      <w:r>
+        <w:t xml:space="preserve">46.8 Git and Version Control</w:t>
+      </w:r>
+    </w:p>
+    <w:p>
+      <w:pPr>
+        <w:pStyle w:val="Compact"/>
+        <w:numPr>
+          <w:ilvl w:val="0"/>
+          <w:numId w:val="1083"/>
+        </w:numPr>
+      </w:pPr>
+      <w:r>
+        <w:t xml:space="preserve">Happy Git and GitHub for the useR</w:t>
+      </w:r>
+      <w:r>
+        <w:t xml:space="preserve"> </w:t>
+      </w:r>
+      <w:r>
+        <w:t xml:space="preserve">(Bryan 2023)</w:t>
+      </w:r>
+      <w:r>
+        <w:t xml:space="preserve"> </w:t>
+      </w:r>
+      <w:r>
+        <w:t xml:space="preserve">- essential guide to using Git and GitHub with R</w:t>
+      </w:r>
+    </w:p>
+    <w:p>
+      <w:pPr>
+        <w:pStyle w:val="Compact"/>
+        <w:numPr>
+          <w:ilvl w:val="0"/>
+          <w:numId w:val="1083"/>
+        </w:numPr>
+      </w:pPr>
+      <w:hyperlink r:id="rId367">
         <w:r>
           <w:rPr>
             <w:rStyle w:val="Hyperlink"/>
@@ -40439,10 +40484,10 @@
         <w:pStyle w:val="Compact"/>
         <w:numPr>
           <w:ilvl w:val="0"/>
-          <w:numId w:val="1082"/>
+          <w:numId w:val="1083"/>
         </w:numPr>
       </w:pPr>
-      <w:hyperlink r:id="rId366">
+      <w:hyperlink r:id="rId368">
         <w:r>
           <w:rPr>
             <w:rStyle w:val="Hyperlink"/>
@@ -40462,10 +40507,10 @@
         <w:pStyle w:val="Compact"/>
         <w:numPr>
           <w:ilvl w:val="0"/>
-          <w:numId w:val="1082"/>
+          <w:numId w:val="1083"/>
         </w:numPr>
       </w:pPr>
-      <w:hyperlink r:id="rId367">
+      <w:hyperlink r:id="rId369">
         <w:r>
           <w:rPr>
             <w:rStyle w:val="VerbatimChar"/>
@@ -40485,10 +40530,10 @@
         <w:pStyle w:val="Compact"/>
         <w:numPr>
           <w:ilvl w:val="0"/>
-          <w:numId w:val="1082"/>
+          <w:numId w:val="1083"/>
         </w:numPr>
       </w:pPr>
-      <w:hyperlink r:id="rId368">
+      <w:hyperlink r:id="rId370">
         <w:r>
           <w:rPr>
             <w:rStyle w:val="Hyperlink"/>
@@ -40508,10 +40553,10 @@
         <w:pStyle w:val="Compact"/>
         <w:numPr>
           <w:ilvl w:val="0"/>
-          <w:numId w:val="1082"/>
+          <w:numId w:val="1083"/>
         </w:numPr>
       </w:pPr>
-      <w:hyperlink r:id="rId369">
+      <w:hyperlink r:id="rId371">
         <w:r>
           <w:rPr>
             <w:rStyle w:val="VerbatimChar"/>
@@ -40532,8 +40577,8 @@
         <w:t xml:space="preserve">organized by patterns like tags or issues</w:t>
       </w:r>
     </w:p>
-    <w:bookmarkStart w:id="386" w:name="refs"/>
-    <w:bookmarkStart w:id="371" w:name="ref-bryan2023happygit"/>
+    <w:bookmarkStart w:id="388" w:name="refs"/>
+    <w:bookmarkStart w:id="373" w:name="ref-bryan2023happygit"/>
     <w:p>
       <w:pPr>
         <w:pStyle w:val="Bibliography"/>
@@ -40557,7 +40602,7 @@
       <w:r>
         <w:t xml:space="preserve"> </w:t>
       </w:r>
-      <w:hyperlink r:id="rId370">
+      <w:hyperlink r:id="rId372">
         <w:r>
           <w:rPr>
             <w:rStyle w:val="Hyperlink"/>
@@ -40569,8 +40614,8 @@
         <w:t xml:space="preserve">.</w:t>
       </w:r>
     </w:p>
-    <w:bookmarkEnd w:id="371"/>
-    <w:bookmarkStart w:id="372" w:name="ref-reprex"/>
+    <w:bookmarkEnd w:id="373"/>
+    <w:bookmarkStart w:id="374" w:name="ref-reprex"/>
     <w:p>
       <w:pPr>
         <w:pStyle w:val="Bibliography"/>
@@ -40606,8 +40651,8 @@
         <w:t xml:space="preserve">.</w:t>
       </w:r>
     </w:p>
-    <w:bookmarkEnd w:id="372"/>
-    <w:bookmarkStart w:id="374" w:name="ref-fay2021engineering"/>
+    <w:bookmarkEnd w:id="374"/>
+    <w:bookmarkStart w:id="376" w:name="ref-fay2021engineering"/>
     <w:p>
       <w:pPr>
         <w:pStyle w:val="Bibliography"/>
@@ -40631,7 +40676,7 @@
       <w:r>
         <w:t xml:space="preserve"> </w:t>
       </w:r>
-      <w:hyperlink r:id="rId373">
+      <w:hyperlink r:id="rId375">
         <w:r>
           <w:rPr>
             <w:rStyle w:val="Hyperlink"/>
@@ -40643,8 +40688,8 @@
         <w:t xml:space="preserve">.</w:t>
       </w:r>
     </w:p>
-    <w:bookmarkEnd w:id="374"/>
-    <w:bookmarkStart w:id="376" w:name="ref-wickham2019advr"/>
+    <w:bookmarkEnd w:id="376"/>
+    <w:bookmarkStart w:id="378" w:name="ref-wickham2019advr"/>
     <w:p>
       <w:pPr>
         <w:pStyle w:val="Bibliography"/>
@@ -40668,7 +40713,7 @@
       <w:r>
         <w:t xml:space="preserve"> </w:t>
       </w:r>
-      <w:hyperlink r:id="rId375">
+      <w:hyperlink r:id="rId377">
         <w:r>
           <w:rPr>
             <w:rStyle w:val="Hyperlink"/>
@@ -40680,8 +40725,8 @@
         <w:t xml:space="preserve">.</w:t>
       </w:r>
     </w:p>
-    <w:bookmarkEnd w:id="376"/>
-    <w:bookmarkStart w:id="378" w:name="ref-wickham2021shiny"/>
+    <w:bookmarkEnd w:id="378"/>
+    <w:bookmarkStart w:id="380" w:name="ref-wickham2021shiny"/>
     <w:p>
       <w:pPr>
         <w:pStyle w:val="Bibliography"/>
@@ -40705,7 +40750,7 @@
       <w:r>
         <w:t xml:space="preserve"> </w:t>
       </w:r>
-      <w:hyperlink r:id="rId377">
+      <w:hyperlink r:id="rId379">
         <w:r>
           <w:rPr>
             <w:rStyle w:val="Hyperlink"/>
@@ -40717,8 +40762,8 @@
         <w:t xml:space="preserve">.</w:t>
       </w:r>
     </w:p>
-    <w:bookmarkEnd w:id="378"/>
-    <w:bookmarkStart w:id="380" w:name="ref-wickham2023tidydesign"/>
+    <w:bookmarkEnd w:id="380"/>
+    <w:bookmarkStart w:id="382" w:name="ref-wickham2023tidydesign"/>
     <w:p>
       <w:pPr>
         <w:pStyle w:val="Bibliography"/>
@@ -40742,7 +40787,7 @@
       <w:r>
         <w:t xml:space="preserve"> </w:t>
       </w:r>
-      <w:hyperlink r:id="rId379">
+      <w:hyperlink r:id="rId381">
         <w:r>
           <w:rPr>
             <w:rStyle w:val="Hyperlink"/>
@@ -40754,8 +40799,8 @@
         <w:t xml:space="preserve">.</w:t>
       </w:r>
     </w:p>
-    <w:bookmarkEnd w:id="380"/>
-    <w:bookmarkStart w:id="382" w:name="ref-wickham2023rpkgs"/>
+    <w:bookmarkEnd w:id="382"/>
+    <w:bookmarkStart w:id="384" w:name="ref-wickham2023rpkgs"/>
     <w:p>
       <w:pPr>
         <w:pStyle w:val="Bibliography"/>
@@ -40779,7 +40824,7 @@
       <w:r>
         <w:t xml:space="preserve"> </w:t>
       </w:r>
-      <w:hyperlink r:id="rId381">
+      <w:hyperlink r:id="rId383">
         <w:r>
           <w:rPr>
             <w:rStyle w:val="Hyperlink"/>
@@ -40791,8 +40836,8 @@
         <w:t xml:space="preserve">.</w:t>
       </w:r>
     </w:p>
-    <w:bookmarkEnd w:id="382"/>
-    <w:bookmarkStart w:id="384" w:name="ref-wickham2023r4ds"/>
+    <w:bookmarkEnd w:id="384"/>
+    <w:bookmarkStart w:id="386" w:name="ref-wickham2023r4ds"/>
     <w:p>
       <w:pPr>
         <w:pStyle w:val="Bibliography"/>
@@ -40816,7 +40861,7 @@
       <w:r>
         <w:t xml:space="preserve"> </w:t>
       </w:r>
-      <w:hyperlink r:id="rId383">
+      <w:hyperlink r:id="rId385">
         <w:r>
           <w:rPr>
             <w:rStyle w:val="Hyperlink"/>
@@ -40828,8 +40873,8 @@
         <w:t xml:space="preserve">.</w:t>
       </w:r>
     </w:p>
-    <w:bookmarkEnd w:id="384"/>
-    <w:bookmarkStart w:id="385" w:name="ref-R-roxygen2"/>
+    <w:bookmarkEnd w:id="386"/>
+    <w:bookmarkStart w:id="387" w:name="ref-R-roxygen2"/>
     <w:p>
       <w:pPr>
         <w:pStyle w:val="Bibliography"/>
@@ -40865,10 +40910,10 @@
         <w:t xml:space="preserve">.</w:t>
       </w:r>
     </w:p>
-    <w:bookmarkEnd w:id="385"/>
-    <w:bookmarkEnd w:id="386"/>
     <w:bookmarkEnd w:id="387"/>
     <w:bookmarkEnd w:id="388"/>
+    <w:bookmarkEnd w:id="389"/>
+    <w:bookmarkEnd w:id="390"/>
     <w:sectPr>
       <w:footnotePr>
         <w:numRestart w:val="eachSect"/>
@@ -41652,6 +41697,9 @@
     <w:abstractNumId w:val="991"/>
   </w:num>
   <w:num w:numId="1082">
+    <w:abstractNumId w:val="991"/>
+  </w:num>
+  <w:num w:numId="1083">
     <w:abstractNumId w:val="991"/>
   </w:num>
 </w:numbering>

</xml_diff>

<commit_message>
Deploying to gh-pages from @ Morrison-Lab/psc@a196e863f9d8be808f844bd46a0a5b14c8519d80 🚀
</commit_message>
<xml_diff>
--- a/chapters/coding-practices.docx
+++ b/chapters/coding-practices.docx
@@ -15,7 +15,7 @@
         <w:pStyle w:val="Date"/>
       </w:pPr>
       <w:r>
-        <w:t xml:space="preserve">Last modified: 2026-10-26 23:11:06 (PDT)</w:t>
+        <w:t xml:space="preserve">Last modified: 2026-10-27 16:10:40 (PDT)</w:t>
       </w:r>
     </w:p>
     <w:p>
@@ -37503,13 +37503,13 @@
       </w:hyperlink>
     </w:p>
     <w:bookmarkEnd w:id="321"/>
-    <w:bookmarkStart w:id="324" w:name="sec-coding-with-r-and-python"/>
+    <w:bookmarkStart w:id="324" w:name="sec-tidyverse-skeptic"/>
     <w:p>
       <w:pPr>
         <w:pStyle w:val="Heading2"/>
       </w:pPr>
       <w:r>
-        <w:t xml:space="preserve">44 Coding with R and Python</w:t>
+        <w:t xml:space="preserve">44 A Skeptical View</w:t>
       </w:r>
     </w:p>
     <w:p>
@@ -37517,12 +37517,420 @@
         <w:pStyle w:val="FirstParagraph"/>
       </w:pPr>
       <w:r>
+        <w:t xml:space="preserve">Not everyone agrees that the Tidyverse should come first.</w:t>
+      </w:r>
+      <w:r>
+        <w:t xml:space="preserve"> </w:t>
+      </w:r>
+      <w:r>
+        <w:t xml:space="preserve">In</w:t>
+      </w:r>
+      <w:r>
+        <w:t xml:space="preserve"> </w:t>
+      </w:r>
+      <w:hyperlink r:id="rId322">
+        <w:r>
+          <w:rPr>
+            <w:rStyle w:val="Hyperlink"/>
+            <w:i/>
+            <w:iCs/>
+          </w:rPr>
+          <w:t xml:space="preserve">Tidyverse Skeptic</w:t>
+        </w:r>
+      </w:hyperlink>
+      <w:r>
+        <w:t xml:space="preserve"> </w:t>
+      </w:r>
+      <w:r>
+        <w:t xml:space="preserve">(2019, source on</w:t>
+      </w:r>
+      <w:r>
+        <w:t xml:space="preserve"> </w:t>
+      </w:r>
+      <w:hyperlink r:id="rId323">
+        <w:r>
+          <w:rPr>
+            <w:rStyle w:val="Hyperlink"/>
+          </w:rPr>
+          <w:t xml:space="preserve">GitHub</w:t>
+        </w:r>
+      </w:hyperlink>
+      <w:r>
+        <w:t xml:space="preserve">)</w:t>
+      </w:r>
+      <w:r>
+        <w:t xml:space="preserve">,</w:t>
+      </w:r>
+      <w:r>
+        <w:t xml:space="preserve"> </w:t>
+      </w:r>
+      <w:r>
+        <w:t xml:space="preserve">Norm Matloff argues that teaching R to noncoders through the Tidyverse is counterproductive.</w:t>
+      </w:r>
+      <w:r>
+        <w:t xml:space="preserve"> </w:t>
+      </w:r>
+      <w:r>
+        <w:t xml:space="preserve">The essay is about teaching beginners,</w:t>
+      </w:r>
+      <w:r>
+        <w:t xml:space="preserve"> </w:t>
+      </w:r>
+      <w:r>
+        <w:t xml:space="preserve">not about teaching computer science students</w:t>
+      </w:r>
+      <w:r>
+        <w:t xml:space="preserve"> </w:t>
+      </w:r>
+      <w:r>
+        <w:t xml:space="preserve">or about whether R is a good tool for experienced coders</w:t>
+      </w:r>
+      <w:r>
+        <w:t xml:space="preserve"> </w:t>
+      </w:r>
+      <w:r>
+        <w:t xml:space="preserve">(which Matloff calls a matter of personal taste).</w:t>
+      </w:r>
+      <w:r>
+        <w:t xml:space="preserve"> </w:t>
+      </w:r>
+      <w:r>
+        <w:t xml:space="preserve">Its main points:</w:t>
+      </w:r>
+    </w:p>
+    <w:p>
+      <w:pPr>
+        <w:pStyle w:val="Compact"/>
+        <w:numPr>
+          <w:ilvl w:val="0"/>
+          <w:numId w:val="1068"/>
+        </w:numPr>
+      </w:pPr>
+      <w:r>
+        <w:rPr>
+          <w:b/>
+          <w:bCs/>
+        </w:rPr>
+        <w:t xml:space="preserve">Keep it simple.</w:t>
+      </w:r>
+      <w:r>
+        <w:t xml:space="preserve"> </w:t>
+      </w:r>
+      <w:r>
+        <w:t xml:space="preserve">Base R (vectors,</w:t>
+      </w:r>
+      <w:r>
+        <w:t xml:space="preserve"> </w:t>
+      </w:r>
+      <w:r>
+        <w:rPr>
+          <w:rStyle w:val="VerbatimChar"/>
+        </w:rPr>
+        <w:t xml:space="preserve">$</w:t>
+      </w:r>
+      <w:r>
+        <w:t xml:space="preserve">, brackets, loops,</w:t>
+      </w:r>
+      <w:r>
+        <w:t xml:space="preserve"> </w:t>
+      </w:r>
+      <w:r>
+        <w:rPr>
+          <w:rStyle w:val="VerbatimChar"/>
+        </w:rPr>
+        <w:t xml:space="preserve">if</w:t>
+      </w:r>
+      <w:r>
+        <w:t xml:space="preserve">/</w:t>
+      </w:r>
+      <w:r>
+        <w:rPr>
+          <w:rStyle w:val="VerbatimChar"/>
+        </w:rPr>
+        <w:t xml:space="preserve">else</w:t>
+      </w:r>
+      <w:r>
+        <w:t xml:space="preserve">) is less abstract than the Tidyverse,</w:t>
+      </w:r>
+      <w:r>
+        <w:t xml:space="preserve"> </w:t>
+      </w:r>
+      <w:r>
+        <w:t xml:space="preserve">so beginners reach useful analyses sooner.</w:t>
+      </w:r>
+    </w:p>
+    <w:p>
+      <w:pPr>
+        <w:pStyle w:val="Compact"/>
+        <w:numPr>
+          <w:ilvl w:val="0"/>
+          <w:numId w:val="1068"/>
+        </w:numPr>
+      </w:pPr>
+      <w:r>
+        <w:rPr>
+          <w:b/>
+          <w:bCs/>
+        </w:rPr>
+        <w:t xml:space="preserve">Functional programming is hard for beginners.</w:t>
+      </w:r>
+      <w:r>
+        <w:t xml:space="preserve"> </w:t>
+      </w:r>
+      <w:r>
+        <w:t xml:space="preserve">Replacing loops with</w:t>
+      </w:r>
+      <w:r>
+        <w:t xml:space="preserve"> </w:t>
+      </w:r>
+      <w:r>
+        <w:rPr>
+          <w:rStyle w:val="VerbatimChar"/>
+        </w:rPr>
+        <w:t xml:space="preserve">{purrr}</w:t>
+      </w:r>
+      <w:r>
+        <w:t xml:space="preserve">-style function calls asks novices to master functions,</w:t>
+      </w:r>
+      <w:r>
+        <w:t xml:space="preserve"> </w:t>
+      </w:r>
+      <w:r>
+        <w:t xml:space="preserve">which Matloff sees as the hardest part of R for them.</w:t>
+      </w:r>
+    </w:p>
+    <w:p>
+      <w:pPr>
+        <w:pStyle w:val="Compact"/>
+        <w:numPr>
+          <w:ilvl w:val="0"/>
+          <w:numId w:val="1068"/>
+        </w:numPr>
+      </w:pPr>
+      <w:r>
+        <w:rPr>
+          <w:b/>
+          <w:bCs/>
+        </w:rPr>
+        <w:t xml:space="preserve">Pipes hinder debugging.</w:t>
+      </w:r>
+      <w:r>
+        <w:t xml:space="preserve"> </w:t>
+      </w:r>
+      <w:r>
+        <w:t xml:space="preserve">Code written as separate statements can be run and checked one line at a time,</w:t>
+      </w:r>
+      <w:r>
+        <w:t xml:space="preserve"> </w:t>
+      </w:r>
+      <w:r>
+        <w:t xml:space="preserve">but a pipe is harder to step through,</w:t>
+      </w:r>
+      <w:r>
+        <w:t xml:space="preserve"> </w:t>
+      </w:r>
+      <w:r>
+        <w:t xml:space="preserve">and beginners are the ones who make the most mistakes.</w:t>
+      </w:r>
+    </w:p>
+    <w:p>
+      <w:pPr>
+        <w:pStyle w:val="Compact"/>
+        <w:numPr>
+          <w:ilvl w:val="0"/>
+          <w:numId w:val="1068"/>
+        </w:numPr>
+      </w:pPr>
+      <w:r>
+        <w:rPr>
+          <w:b/>
+          <w:bCs/>
+        </w:rPr>
+        <w:t xml:space="preserve">Narrow coverage looks like success.</w:t>
+      </w:r>
+      <w:r>
+        <w:t xml:space="preserve"> </w:t>
+      </w:r>
+      <w:r>
+        <w:t xml:space="preserve">Courses built around a few</w:t>
+      </w:r>
+      <w:r>
+        <w:t xml:space="preserve"> </w:t>
+      </w:r>
+      <w:r>
+        <w:rPr>
+          <w:rStyle w:val="VerbatimChar"/>
+        </w:rPr>
+        <w:t xml:space="preserve">{dplyr}</w:t>
+      </w:r>
+      <w:r>
+        <w:t xml:space="preserve"> </w:t>
+      </w:r>
+      <w:r>
+        <w:t xml:space="preserve">verbs leave students unable to use the many CRAN packages</w:t>
+      </w:r>
+      <w:r>
+        <w:t xml:space="preserve"> </w:t>
+      </w:r>
+      <w:r>
+        <w:t xml:space="preserve">that expect base R idioms such as</w:t>
+      </w:r>
+      <w:r>
+        <w:t xml:space="preserve"> </w:t>
+      </w:r>
+      <w:r>
+        <w:rPr>
+          <w:rStyle w:val="VerbatimChar"/>
+        </w:rPr>
+        <w:t xml:space="preserve">$</w:t>
+      </w:r>
+      <w:r>
+        <w:t xml:space="preserve">, subscripting, and</w:t>
+      </w:r>
+      <w:r>
+        <w:t xml:space="preserve"> </w:t>
+      </w:r>
+      <w:r>
+        <w:rPr>
+          <w:rStyle w:val="VerbatimChar"/>
+        </w:rPr>
+        <w:t xml:space="preserve">summary()</w:t>
+      </w:r>
+      <w:r>
+        <w:t xml:space="preserve">.</w:t>
+      </w:r>
+    </w:p>
+    <w:p>
+      <w:pPr>
+        <w:pStyle w:val="Compact"/>
+        <w:numPr>
+          <w:ilvl w:val="0"/>
+          <w:numId w:val="1068"/>
+        </w:numPr>
+      </w:pPr>
+      <w:r>
+        <w:rPr>
+          <w:b/>
+          <w:bCs/>
+        </w:rPr>
+        <w:t xml:space="preserve">Teach a mix.</w:t>
+      </w:r>
+      <w:r>
+        <w:t xml:space="preserve"> </w:t>
+      </w:r>
+      <w:r>
+        <w:t xml:space="preserve">Start with base R, then cover the Tidyverse (because it is popular)</w:t>
+      </w:r>
+      <w:r>
+        <w:t xml:space="preserve"> </w:t>
+      </w:r>
+      <w:r>
+        <w:t xml:space="preserve">and</w:t>
+      </w:r>
+      <w:r>
+        <w:t xml:space="preserve"> </w:t>
+      </w:r>
+      <w:r>
+        <w:rPr>
+          <w:rStyle w:val="VerbatimChar"/>
+        </w:rPr>
+        <w:t xml:space="preserve">{data.table}</w:t>
+      </w:r>
+      <w:r>
+        <w:t xml:space="preserve"> </w:t>
+      </w:r>
+      <w:r>
+        <w:t xml:space="preserve">(because it is fast),</w:t>
+      </w:r>
+      <w:r>
+        <w:t xml:space="preserve"> </w:t>
+      </w:r>
+      <w:r>
+        <w:t xml:space="preserve">so learners can choose the most convenient tool for each task.</w:t>
+      </w:r>
+    </w:p>
+    <w:p>
+      <w:pPr>
+        <w:pStyle w:val="FirstParagraph"/>
+      </w:pPr>
+      <w:r>
+        <w:t xml:space="preserve">Matloff also notes that</w:t>
+      </w:r>
+      <w:r>
+        <w:t xml:space="preserve"> </w:t>
+      </w:r>
+      <w:r>
+        <w:rPr>
+          <w:rStyle w:val="VerbatimChar"/>
+        </w:rPr>
+        <w:t xml:space="preserve">{ggplot2}</w:t>
+      </w:r>
+      <w:r>
+        <w:t xml:space="preserve"> </w:t>
+      </w:r>
+      <w:r>
+        <w:t xml:space="preserve">predates the Tidyverse,</w:t>
+      </w:r>
+      <w:r>
+        <w:t xml:space="preserve"> </w:t>
+      </w:r>
+      <w:r>
+        <w:t xml:space="preserve">and while he praises Posit’s overall contribution to R,</w:t>
+      </w:r>
+      <w:r>
+        <w:t xml:space="preserve"> </w:t>
+      </w:r>
+      <w:r>
+        <w:t xml:space="preserve">he raises concerns about one company steering an open-source ecosystem.</w:t>
+      </w:r>
+    </w:p>
+    <w:p>
+      <w:pPr>
+        <w:pStyle w:val="BodyText"/>
+      </w:pPr>
+      <w:r>
+        <w:t xml:space="preserve">Our recommendation above still stands for day-to-day project code,</w:t>
+      </w:r>
+      <w:r>
+        <w:t xml:space="preserve"> </w:t>
+      </w:r>
+      <w:r>
+        <w:t xml:space="preserve">but the essay is a useful counterweight:</w:t>
+      </w:r>
+      <w:r>
+        <w:t xml:space="preserve"> </w:t>
+      </w:r>
+      <w:r>
+        <w:t xml:space="preserve">learn enough base R to read other people’s code, debug your own,</w:t>
+      </w:r>
+      <w:r>
+        <w:t xml:space="preserve"> </w:t>
+      </w:r>
+      <w:r>
+        <w:t xml:space="preserve">and use the many packages that are not built around the Tidyverse.</w:t>
+      </w:r>
+    </w:p>
+    <w:bookmarkEnd w:id="324"/>
+    <w:bookmarkStart w:id="327" w:name="sec-coding-with-r-and-python"/>
+    <w:p>
+      <w:pPr>
+        <w:pStyle w:val="Heading2"/>
+      </w:pPr>
+      <w:r>
+        <w:t xml:space="preserve">45 Coding with R and Python</w:t>
+      </w:r>
+    </w:p>
+    <w:p>
+      <w:pPr>
+        <w:pStyle w:val="FirstParagraph"/>
+      </w:pPr>
+      <w:r>
         <w:t xml:space="preserve">If you’re using both R and Python, you may wish to check out the</w:t>
       </w:r>
       <w:r>
         <w:t xml:space="preserve"> </w:t>
       </w:r>
-      <w:hyperlink r:id="rId322">
+      <w:hyperlink r:id="rId325">
         <w:r>
           <w:rPr>
             <w:rStyle w:val="Hyperlink"/>
@@ -37539,7 +37947,7 @@
       <w:r>
         <w:t xml:space="preserve"> </w:t>
       </w:r>
-      <w:hyperlink r:id="rId323">
+      <w:hyperlink r:id="rId326">
         <w:r>
           <w:rPr>
             <w:rStyle w:val="Hyperlink"/>
@@ -37551,14 +37959,14 @@
         <w:t xml:space="preserve">.</w:t>
       </w:r>
     </w:p>
-    <w:bookmarkEnd w:id="324"/>
-    <w:bookmarkStart w:id="330" w:name="X06dce33c5a777f8322711dde05e81eef8b1d1f6"/>
+    <w:bookmarkEnd w:id="327"/>
+    <w:bookmarkStart w:id="333" w:name="X06dce33c5a777f8322711dde05e81eef8b1d1f6"/>
     <w:p>
       <w:pPr>
         <w:pStyle w:val="Heading2"/>
       </w:pPr>
       <w:r>
-        <w:t xml:space="preserve">45 Repeating analyses with different variations</w:t>
+        <w:t xml:space="preserve">46 Repeating analyses with different variations</w:t>
       </w:r>
     </w:p>
     <w:p>
@@ -37607,13 +38015,13 @@
         <w:t xml:space="preserve">Fortunately, R has some functions which implement looping in a compact form to help repeating your analyses with different variations (subgroups, outcomes, covariate sets, etc.) with better performances.</w:t>
       </w:r>
     </w:p>
-    <w:bookmarkStart w:id="325" w:name="lapply-and-sapply-1"/>
+    <w:bookmarkStart w:id="328" w:name="lapply-and-sapply-1"/>
     <w:p>
       <w:pPr>
         <w:pStyle w:val="Heading3"/>
       </w:pPr>
       <w:r>
-        <w:t xml:space="preserve">45.1</w:t>
+        <w:t xml:space="preserve">46.1</w:t>
       </w:r>
       <w:r>
         <w:t xml:space="preserve"> </w:t>
@@ -37730,14 +38138,14 @@
         <w:t xml:space="preserve">will simplify the output to the simplest data structure possible, which will usually be a vector.</w:t>
       </w:r>
     </w:p>
-    <w:bookmarkEnd w:id="325"/>
-    <w:bookmarkStart w:id="326" w:name="mapply-and-pmap"/>
+    <w:bookmarkEnd w:id="328"/>
+    <w:bookmarkStart w:id="329" w:name="mapply-and-pmap"/>
     <w:p>
       <w:pPr>
         <w:pStyle w:val="Heading3"/>
       </w:pPr>
       <w:r>
-        <w:t xml:space="preserve">45.2</w:t>
+        <w:t xml:space="preserve">46.2</w:t>
       </w:r>
       <w:r>
         <w:t xml:space="preserve"> </w:t>
@@ -38657,14 +39065,14 @@
         <w:t xml:space="preserve">to combine them.</w:t>
       </w:r>
     </w:p>
-    <w:bookmarkEnd w:id="326"/>
-    <w:bookmarkStart w:id="329" w:name="Xf551672fa8f1190aa44df63554b00ab4edf5974"/>
+    <w:bookmarkEnd w:id="329"/>
+    <w:bookmarkStart w:id="332" w:name="Xf551672fa8f1190aa44df63554b00ab4edf5974"/>
     <w:p>
       <w:pPr>
         <w:pStyle w:val="Heading3"/>
       </w:pPr>
       <w:r>
-        <w:t xml:space="preserve">45.3 Parallel processing with</w:t>
+        <w:t xml:space="preserve">46.3 Parallel processing with</w:t>
       </w:r>
       <w:r>
         <w:t xml:space="preserve"> </w:t>
@@ -38877,7 +39285,7 @@
         <w:t xml:space="preserve">into smaller chunks and apply the function to each element of the several chunks in parallel in different cores to significantly reduce the run time.</w:t>
       </w:r>
     </w:p>
-    <w:bookmarkStart w:id="327" w:name="parlapply"/>
+    <w:bookmarkStart w:id="330" w:name="parlapply"/>
     <w:p>
       <w:pPr>
         <w:pStyle w:val="Heading4"/>
@@ -39161,8 +39569,8 @@
         <w:t xml:space="preserve">again.</w:t>
       </w:r>
     </w:p>
-    <w:bookmarkEnd w:id="327"/>
-    <w:bookmarkStart w:id="328" w:name="future_lapply"/>
+    <w:bookmarkEnd w:id="330"/>
+    <w:bookmarkStart w:id="331" w:name="future_lapply"/>
     <w:p>
       <w:pPr>
         <w:pStyle w:val="Heading4"/>
@@ -39369,16 +39777,16 @@
         <w:t xml:space="preserve">.</w:t>
       </w:r>
     </w:p>
-    <w:bookmarkEnd w:id="328"/>
-    <w:bookmarkEnd w:id="329"/>
-    <w:bookmarkEnd w:id="330"/>
-    <w:bookmarkStart w:id="339" w:name="sec-reviewing-code"/>
+    <w:bookmarkEnd w:id="331"/>
+    <w:bookmarkEnd w:id="332"/>
+    <w:bookmarkEnd w:id="333"/>
+    <w:bookmarkStart w:id="342" w:name="sec-reviewing-code"/>
     <w:p>
       <w:pPr>
         <w:pStyle w:val="Heading2"/>
       </w:pPr>
       <w:r>
-        <w:t xml:space="preserve">46 Reviewing Code</w:t>
+        <w:t xml:space="preserve">47 Reviewing Code</w:t>
       </w:r>
     </w:p>
     <w:p>
@@ -39415,7 +39823,7 @@
       <w:r>
         <w:t xml:space="preserve"> </w:t>
       </w:r>
-      <w:hyperlink r:id="rId331">
+      <w:hyperlink r:id="rId334">
         <w:r>
           <w:rPr>
             <w:rStyle w:val="Hyperlink"/>
@@ -39427,13 +39835,13 @@
         <w:t xml:space="preserve">.</w:t>
       </w:r>
     </w:p>
-    <w:bookmarkStart w:id="332" w:name="sec-why-review-code"/>
+    <w:bookmarkStart w:id="335" w:name="sec-why-review-code"/>
     <w:p>
       <w:pPr>
         <w:pStyle w:val="Heading3"/>
       </w:pPr>
       <w:r>
-        <w:t xml:space="preserve">46.1 Why We Review Code</w:t>
+        <w:t xml:space="preserve">47.1 Why We Review Code</w:t>
       </w:r>
     </w:p>
     <w:p>
@@ -39442,124 +39850,6 @@
       </w:pPr>
       <w:r>
         <w:t xml:space="preserve">Code review serves several vital purposes:</w:t>
-      </w:r>
-    </w:p>
-    <w:p>
-      <w:pPr>
-        <w:pStyle w:val="Compact"/>
-        <w:numPr>
-          <w:ilvl w:val="0"/>
-          <w:numId w:val="1068"/>
-        </w:numPr>
-      </w:pPr>
-      <w:r>
-        <w:rPr>
-          <w:b/>
-          <w:bCs/>
-        </w:rPr>
-        <w:t xml:space="preserve">Error prevention</w:t>
-      </w:r>
-      <w:r>
-        <w:t xml:space="preserve">: Catching data processing and analytical bugs early,</w:t>
-      </w:r>
-      <w:r>
-        <w:t xml:space="preserve"> </w:t>
-      </w:r>
-      <w:r>
-        <w:t xml:space="preserve">before findings enter manuscripts or reports.</w:t>
-      </w:r>
-    </w:p>
-    <w:p>
-      <w:pPr>
-        <w:pStyle w:val="Compact"/>
-        <w:numPr>
-          <w:ilvl w:val="0"/>
-          <w:numId w:val="1068"/>
-        </w:numPr>
-      </w:pPr>
-      <w:r>
-        <w:rPr>
-          <w:b/>
-          <w:bCs/>
-        </w:rPr>
-        <w:t xml:space="preserve">Reproducibility</w:t>
-      </w:r>
-      <w:r>
-        <w:t xml:space="preserve">: Verifying that scripts execute cleanly from scratch</w:t>
-      </w:r>
-      <w:r>
-        <w:t xml:space="preserve"> </w:t>
-      </w:r>
-      <w:r>
-        <w:t xml:space="preserve">without undocumented manual interventions or environment-specific dependencies.</w:t>
-      </w:r>
-    </w:p>
-    <w:p>
-      <w:pPr>
-        <w:pStyle w:val="Compact"/>
-        <w:numPr>
-          <w:ilvl w:val="0"/>
-          <w:numId w:val="1068"/>
-        </w:numPr>
-      </w:pPr>
-      <w:r>
-        <w:rPr>
-          <w:b/>
-          <w:bCs/>
-        </w:rPr>
-        <w:t xml:space="preserve">Knowledge transfer</w:t>
-      </w:r>
-      <w:r>
-        <w:t xml:space="preserve">: Sharing analytical methods, R idioms,</w:t>
-      </w:r>
-      <w:r>
-        <w:t xml:space="preserve"> </w:t>
-      </w:r>
-      <w:r>
-        <w:t xml:space="preserve">and package features across the team.</w:t>
-      </w:r>
-    </w:p>
-    <w:p>
-      <w:pPr>
-        <w:pStyle w:val="Compact"/>
-        <w:numPr>
-          <w:ilvl w:val="0"/>
-          <w:numId w:val="1068"/>
-        </w:numPr>
-      </w:pPr>
-      <w:r>
-        <w:rPr>
-          <w:b/>
-          <w:bCs/>
-        </w:rPr>
-        <w:t xml:space="preserve">Maintainability</w:t>
-      </w:r>
-      <w:r>
-        <w:t xml:space="preserve">: Ensuring that analysis pipelines can be understood,</w:t>
-      </w:r>
-      <w:r>
-        <w:t xml:space="preserve"> </w:t>
-      </w:r>
-      <w:r>
-        <w:t xml:space="preserve">modified, and extended by other team members in the future.</w:t>
-      </w:r>
-    </w:p>
-    <w:bookmarkEnd w:id="332"/>
-    <w:bookmarkStart w:id="336" w:name="sec-what-to-look-for"/>
-    <w:p>
-      <w:pPr>
-        <w:pStyle w:val="Heading3"/>
-      </w:pPr>
-      <w:r>
-        <w:t xml:space="preserve">46.2 What Reviewers Look For</w:t>
-      </w:r>
-    </w:p>
-    <w:p>
-      <w:pPr>
-        <w:pStyle w:val="FirstParagraph"/>
-      </w:pPr>
-      <w:r>
-        <w:t xml:space="preserve">When reviewing a colleague’s code, evaluate these key dimensions:</w:t>
       </w:r>
     </w:p>
     <w:p>
@@ -39575,6 +39865,124 @@
           <w:b/>
           <w:bCs/>
         </w:rPr>
+        <w:t xml:space="preserve">Error prevention</w:t>
+      </w:r>
+      <w:r>
+        <w:t xml:space="preserve">: Catching data processing and analytical bugs early,</w:t>
+      </w:r>
+      <w:r>
+        <w:t xml:space="preserve"> </w:t>
+      </w:r>
+      <w:r>
+        <w:t xml:space="preserve">before findings enter manuscripts or reports.</w:t>
+      </w:r>
+    </w:p>
+    <w:p>
+      <w:pPr>
+        <w:pStyle w:val="Compact"/>
+        <w:numPr>
+          <w:ilvl w:val="0"/>
+          <w:numId w:val="1069"/>
+        </w:numPr>
+      </w:pPr>
+      <w:r>
+        <w:rPr>
+          <w:b/>
+          <w:bCs/>
+        </w:rPr>
+        <w:t xml:space="preserve">Reproducibility</w:t>
+      </w:r>
+      <w:r>
+        <w:t xml:space="preserve">: Verifying that scripts execute cleanly from scratch</w:t>
+      </w:r>
+      <w:r>
+        <w:t xml:space="preserve"> </w:t>
+      </w:r>
+      <w:r>
+        <w:t xml:space="preserve">without undocumented manual interventions or environment-specific dependencies.</w:t>
+      </w:r>
+    </w:p>
+    <w:p>
+      <w:pPr>
+        <w:pStyle w:val="Compact"/>
+        <w:numPr>
+          <w:ilvl w:val="0"/>
+          <w:numId w:val="1069"/>
+        </w:numPr>
+      </w:pPr>
+      <w:r>
+        <w:rPr>
+          <w:b/>
+          <w:bCs/>
+        </w:rPr>
+        <w:t xml:space="preserve">Knowledge transfer</w:t>
+      </w:r>
+      <w:r>
+        <w:t xml:space="preserve">: Sharing analytical methods, R idioms,</w:t>
+      </w:r>
+      <w:r>
+        <w:t xml:space="preserve"> </w:t>
+      </w:r>
+      <w:r>
+        <w:t xml:space="preserve">and package features across the team.</w:t>
+      </w:r>
+    </w:p>
+    <w:p>
+      <w:pPr>
+        <w:pStyle w:val="Compact"/>
+        <w:numPr>
+          <w:ilvl w:val="0"/>
+          <w:numId w:val="1069"/>
+        </w:numPr>
+      </w:pPr>
+      <w:r>
+        <w:rPr>
+          <w:b/>
+          <w:bCs/>
+        </w:rPr>
+        <w:t xml:space="preserve">Maintainability</w:t>
+      </w:r>
+      <w:r>
+        <w:t xml:space="preserve">: Ensuring that analysis pipelines can be understood,</w:t>
+      </w:r>
+      <w:r>
+        <w:t xml:space="preserve"> </w:t>
+      </w:r>
+      <w:r>
+        <w:t xml:space="preserve">modified, and extended by other team members in the future.</w:t>
+      </w:r>
+    </w:p>
+    <w:bookmarkEnd w:id="335"/>
+    <w:bookmarkStart w:id="339" w:name="sec-what-to-look-for"/>
+    <w:p>
+      <w:pPr>
+        <w:pStyle w:val="Heading3"/>
+      </w:pPr>
+      <w:r>
+        <w:t xml:space="preserve">47.2 What Reviewers Look For</w:t>
+      </w:r>
+    </w:p>
+    <w:p>
+      <w:pPr>
+        <w:pStyle w:val="FirstParagraph"/>
+      </w:pPr>
+      <w:r>
+        <w:t xml:space="preserve">When reviewing a colleague’s code, evaluate these key dimensions:</w:t>
+      </w:r>
+    </w:p>
+    <w:p>
+      <w:pPr>
+        <w:pStyle w:val="Compact"/>
+        <w:numPr>
+          <w:ilvl w:val="0"/>
+          <w:numId w:val="1070"/>
+        </w:numPr>
+      </w:pPr>
+      <w:r>
+        <w:rPr>
+          <w:b/>
+          <w:bCs/>
+        </w:rPr>
         <w:t xml:space="preserve">Reproducibility</w:t>
       </w:r>
       <w:r>
@@ -39586,7 +39994,7 @@
         <w:pStyle w:val="Compact"/>
         <w:numPr>
           <w:ilvl w:val="1"/>
-          <w:numId w:val="1070"/>
+          <w:numId w:val="1071"/>
         </w:numPr>
       </w:pPr>
       <w:r>
@@ -39598,7 +40006,7 @@
         <w:pStyle w:val="Compact"/>
         <w:numPr>
           <w:ilvl w:val="1"/>
-          <w:numId w:val="1070"/>
+          <w:numId w:val="1071"/>
         </w:numPr>
       </w:pPr>
       <w:r>
@@ -39607,7 +40015,7 @@
       <w:r>
         <w:t xml:space="preserve"> </w:t>
       </w:r>
-      <w:hyperlink r:id="rId333">
+      <w:hyperlink r:id="rId336">
         <w:r>
           <w:rPr>
             <w:rStyle w:val="VerbatimChar"/>
@@ -39624,7 +40032,7 @@
       <w:r>
         <w:t xml:space="preserve"> </w:t>
       </w:r>
-      <w:hyperlink r:id="rId334">
+      <w:hyperlink r:id="rId337">
         <w:r>
           <w:rPr>
             <w:rStyle w:val="Hyperlink"/>
@@ -39641,7 +40049,7 @@
         <w:pStyle w:val="Compact"/>
         <w:numPr>
           <w:ilvl w:val="1"/>
-          <w:numId w:val="1070"/>
+          <w:numId w:val="1071"/>
         </w:numPr>
       </w:pPr>
       <w:r>
@@ -39690,7 +40098,7 @@
         <w:pStyle w:val="Compact"/>
         <w:numPr>
           <w:ilvl w:val="0"/>
-          <w:numId w:val="1069"/>
+          <w:numId w:val="1070"/>
         </w:numPr>
       </w:pPr>
       <w:r>
@@ -39709,7 +40117,7 @@
         <w:pStyle w:val="Compact"/>
         <w:numPr>
           <w:ilvl w:val="1"/>
-          <w:numId w:val="1071"/>
+          <w:numId w:val="1072"/>
         </w:numPr>
       </w:pPr>
       <w:r>
@@ -39721,7 +40129,7 @@
         <w:pStyle w:val="Compact"/>
         <w:numPr>
           <w:ilvl w:val="1"/>
-          <w:numId w:val="1071"/>
+          <w:numId w:val="1072"/>
         </w:numPr>
       </w:pPr>
       <w:r>
@@ -39742,7 +40150,7 @@
         <w:pStyle w:val="Compact"/>
         <w:numPr>
           <w:ilvl w:val="1"/>
-          <w:numId w:val="1071"/>
+          <w:numId w:val="1072"/>
         </w:numPr>
       </w:pPr>
       <w:r>
@@ -39768,7 +40176,7 @@
         <w:pStyle w:val="Compact"/>
         <w:numPr>
           <w:ilvl w:val="0"/>
-          <w:numId w:val="1069"/>
+          <w:numId w:val="1070"/>
         </w:numPr>
       </w:pPr>
       <w:r>
@@ -39787,7 +40195,7 @@
         <w:pStyle w:val="Compact"/>
         <w:numPr>
           <w:ilvl w:val="1"/>
-          <w:numId w:val="1072"/>
+          <w:numId w:val="1073"/>
         </w:numPr>
       </w:pPr>
       <w:r>
@@ -39796,7 +40204,7 @@
       <w:r>
         <w:t xml:space="preserve"> </w:t>
       </w:r>
-      <w:hyperlink r:id="rId335">
+      <w:hyperlink r:id="rId338">
         <w:r>
           <w:rPr>
             <w:rStyle w:val="Hyperlink"/>
@@ -39813,7 +40221,7 @@
         <w:pStyle w:val="Compact"/>
         <w:numPr>
           <w:ilvl w:val="1"/>
-          <w:numId w:val="1072"/>
+          <w:numId w:val="1073"/>
         </w:numPr>
       </w:pPr>
       <w:r>
@@ -39839,7 +40247,7 @@
         <w:pStyle w:val="Compact"/>
         <w:numPr>
           <w:ilvl w:val="1"/>
-          <w:numId w:val="1072"/>
+          <w:numId w:val="1073"/>
         </w:numPr>
       </w:pPr>
       <w:r>
@@ -39865,7 +40273,7 @@
         <w:pStyle w:val="Compact"/>
         <w:numPr>
           <w:ilvl w:val="0"/>
-          <w:numId w:val="1069"/>
+          <w:numId w:val="1070"/>
         </w:numPr>
       </w:pPr>
       <w:r>
@@ -39884,7 +40292,7 @@
         <w:pStyle w:val="Compact"/>
         <w:numPr>
           <w:ilvl w:val="1"/>
-          <w:numId w:val="1073"/>
+          <w:numId w:val="1074"/>
         </w:numPr>
       </w:pPr>
       <w:r>
@@ -39910,7 +40318,7 @@
         <w:pStyle w:val="Compact"/>
         <w:numPr>
           <w:ilvl w:val="1"/>
-          <w:numId w:val="1073"/>
+          <w:numId w:val="1074"/>
         </w:numPr>
       </w:pPr>
       <w:r>
@@ -39931,14 +40339,14 @@
         <w:t xml:space="preserve">)?</w:t>
       </w:r>
     </w:p>
-    <w:bookmarkEnd w:id="336"/>
-    <w:bookmarkStart w:id="337" w:name="sec-constructive-feedback"/>
+    <w:bookmarkEnd w:id="339"/>
+    <w:bookmarkStart w:id="340" w:name="sec-constructive-feedback"/>
     <w:p>
       <w:pPr>
         <w:pStyle w:val="Heading3"/>
       </w:pPr>
       <w:r>
-        <w:t xml:space="preserve">46.3 How to Give Constructive Feedback</w:t>
+        <w:t xml:space="preserve">47.3 How to Give Constructive Feedback</w:t>
       </w:r>
     </w:p>
     <w:p>
@@ -39947,130 +40355,6 @@
       </w:pPr>
       <w:r>
         <w:t xml:space="preserve">Effective code review builds a supportive, high-trust research culture:</w:t>
-      </w:r>
-    </w:p>
-    <w:p>
-      <w:pPr>
-        <w:pStyle w:val="Compact"/>
-        <w:numPr>
-          <w:ilvl w:val="0"/>
-          <w:numId w:val="1074"/>
-        </w:numPr>
-      </w:pPr>
-      <w:r>
-        <w:rPr>
-          <w:b/>
-          <w:bCs/>
-        </w:rPr>
-        <w:t xml:space="preserve">Be kind and respectful</w:t>
-      </w:r>
-      <w:r>
-        <w:t xml:space="preserve">: Critique the code, not the author.</w:t>
-      </w:r>
-      <w:r>
-        <w:t xml:space="preserve"> </w:t>
-      </w:r>
-      <w:r>
-        <w:t xml:space="preserve">Assume positive intent and acknowledge elegant solutions or clear documentation.</w:t>
-      </w:r>
-    </w:p>
-    <w:p>
-      <w:pPr>
-        <w:pStyle w:val="Compact"/>
-        <w:numPr>
-          <w:ilvl w:val="0"/>
-          <w:numId w:val="1074"/>
-        </w:numPr>
-      </w:pPr>
-      <w:r>
-        <w:rPr>
-          <w:b/>
-          <w:bCs/>
-        </w:rPr>
-        <w:t xml:space="preserve">Be specific and actionable</w:t>
-      </w:r>
-      <w:r>
-        <w:t xml:space="preserve">: Explain why a change is recommended</w:t>
-      </w:r>
-      <w:r>
-        <w:t xml:space="preserve"> </w:t>
-      </w:r>
-      <w:r>
-        <w:t xml:space="preserve">and provide concrete code suggestions or examples where possible.</w:t>
-      </w:r>
-    </w:p>
-    <w:p>
-      <w:pPr>
-        <w:pStyle w:val="Compact"/>
-        <w:numPr>
-          <w:ilvl w:val="0"/>
-          <w:numId w:val="1074"/>
-        </w:numPr>
-      </w:pPr>
-      <w:r>
-        <w:rPr>
-          <w:b/>
-          <w:bCs/>
-        </w:rPr>
-        <w:t xml:space="preserve">Distinguish blocking vs. non-blocking comments</w:t>
-      </w:r>
-      <w:r>
-        <w:t xml:space="preserve">:</w:t>
-      </w:r>
-      <w:r>
-        <w:t xml:space="preserve"> </w:t>
-      </w:r>
-      <w:r>
-        <w:t xml:space="preserve">Clearly separate essential correctness or reproducibility issues (blocking)</w:t>
-      </w:r>
-      <w:r>
-        <w:t xml:space="preserve"> </w:t>
-      </w:r>
-      <w:r>
-        <w:t xml:space="preserve">from optional stylistic preferences or ideas for future exploration (non-blocking nits).</w:t>
-      </w:r>
-    </w:p>
-    <w:p>
-      <w:pPr>
-        <w:pStyle w:val="Compact"/>
-        <w:numPr>
-          <w:ilvl w:val="0"/>
-          <w:numId w:val="1074"/>
-        </w:numPr>
-      </w:pPr>
-      <w:r>
-        <w:rPr>
-          <w:b/>
-          <w:bCs/>
-        </w:rPr>
-        <w:t xml:space="preserve">Ask clarifying questions</w:t>
-      </w:r>
-      <w:r>
-        <w:t xml:space="preserve">: When logic is unclear,</w:t>
-      </w:r>
-      <w:r>
-        <w:t xml:space="preserve"> </w:t>
-      </w:r>
-      <w:r>
-        <w:t xml:space="preserve">ask the author to explain their intent before proposing a rewrite.</w:t>
-      </w:r>
-    </w:p>
-    <w:bookmarkEnd w:id="337"/>
-    <w:bookmarkStart w:id="338" w:name="sec-when-to-approve"/>
-    <w:p>
-      <w:pPr>
-        <w:pStyle w:val="Heading3"/>
-      </w:pPr>
-      <w:r>
-        <w:t xml:space="preserve">46.4 When to Approve</w:t>
-      </w:r>
-    </w:p>
-    <w:p>
-      <w:pPr>
-        <w:pStyle w:val="FirstParagraph"/>
-      </w:pPr>
-      <w:r>
-        <w:t xml:space="preserve">Approve a pull request when:</w:t>
       </w:r>
     </w:p>
     <w:p>
@@ -40082,7 +40366,20 @@
         </w:numPr>
       </w:pPr>
       <w:r>
-        <w:t xml:space="preserve">All automated CI checks and workflows pass cleanly.</w:t>
+        <w:rPr>
+          <w:b/>
+          <w:bCs/>
+        </w:rPr>
+        <w:t xml:space="preserve">Be kind and respectful</w:t>
+      </w:r>
+      <w:r>
+        <w:t xml:space="preserve">: Critique the code, not the author.</w:t>
+      </w:r>
+      <w:r>
+        <w:t xml:space="preserve"> </w:t>
+      </w:r>
+      <w:r>
+        <w:t xml:space="preserve">Assume positive intent and acknowledge elegant solutions or clear documentation.</w:t>
       </w:r>
     </w:p>
     <w:p>
@@ -40094,7 +40391,20 @@
         </w:numPr>
       </w:pPr>
       <w:r>
-        <w:t xml:space="preserve">The code runs end-to-end and produces expected outputs.</w:t>
+        <w:rPr>
+          <w:b/>
+          <w:bCs/>
+        </w:rPr>
+        <w:t xml:space="preserve">Be specific and actionable</w:t>
+      </w:r>
+      <w:r>
+        <w:t xml:space="preserve">: Explain why a change is recommended</w:t>
+      </w:r>
+      <w:r>
+        <w:t xml:space="preserve"> </w:t>
+      </w:r>
+      <w:r>
+        <w:t xml:space="preserve">and provide concrete code suggestions or examples where possible.</w:t>
       </w:r>
     </w:p>
     <w:p>
@@ -40106,7 +40416,26 @@
         </w:numPr>
       </w:pPr>
       <w:r>
-        <w:t xml:space="preserve">All blocking review findings have been resolved or explicitly deferred to a tracked follow-up issue.</w:t>
+        <w:rPr>
+          <w:b/>
+          <w:bCs/>
+        </w:rPr>
+        <w:t xml:space="preserve">Distinguish blocking vs. non-blocking comments</w:t>
+      </w:r>
+      <w:r>
+        <w:t xml:space="preserve">:</w:t>
+      </w:r>
+      <w:r>
+        <w:t xml:space="preserve"> </w:t>
+      </w:r>
+      <w:r>
+        <w:t xml:space="preserve">Clearly separate essential correctness or reproducibility issues (blocking)</w:t>
+      </w:r>
+      <w:r>
+        <w:t xml:space="preserve"> </w:t>
+      </w:r>
+      <w:r>
+        <w:t xml:space="preserve">from optional stylistic preferences or ideas for future exploration (non-blocking nits).</w:t>
       </w:r>
     </w:p>
     <w:p>
@@ -40115,6 +40444,85 @@
         <w:numPr>
           <w:ilvl w:val="0"/>
           <w:numId w:val="1075"/>
+        </w:numPr>
+      </w:pPr>
+      <w:r>
+        <w:rPr>
+          <w:b/>
+          <w:bCs/>
+        </w:rPr>
+        <w:t xml:space="preserve">Ask clarifying questions</w:t>
+      </w:r>
+      <w:r>
+        <w:t xml:space="preserve">: When logic is unclear,</w:t>
+      </w:r>
+      <w:r>
+        <w:t xml:space="preserve"> </w:t>
+      </w:r>
+      <w:r>
+        <w:t xml:space="preserve">ask the author to explain their intent before proposing a rewrite.</w:t>
+      </w:r>
+    </w:p>
+    <w:bookmarkEnd w:id="340"/>
+    <w:bookmarkStart w:id="341" w:name="sec-when-to-approve"/>
+    <w:p>
+      <w:pPr>
+        <w:pStyle w:val="Heading3"/>
+      </w:pPr>
+      <w:r>
+        <w:t xml:space="preserve">47.4 When to Approve</w:t>
+      </w:r>
+    </w:p>
+    <w:p>
+      <w:pPr>
+        <w:pStyle w:val="FirstParagraph"/>
+      </w:pPr>
+      <w:r>
+        <w:t xml:space="preserve">Approve a pull request when:</w:t>
+      </w:r>
+    </w:p>
+    <w:p>
+      <w:pPr>
+        <w:pStyle w:val="Compact"/>
+        <w:numPr>
+          <w:ilvl w:val="0"/>
+          <w:numId w:val="1076"/>
+        </w:numPr>
+      </w:pPr>
+      <w:r>
+        <w:t xml:space="preserve">All automated CI checks and workflows pass cleanly.</w:t>
+      </w:r>
+    </w:p>
+    <w:p>
+      <w:pPr>
+        <w:pStyle w:val="Compact"/>
+        <w:numPr>
+          <w:ilvl w:val="0"/>
+          <w:numId w:val="1076"/>
+        </w:numPr>
+      </w:pPr>
+      <w:r>
+        <w:t xml:space="preserve">The code runs end-to-end and produces expected outputs.</w:t>
+      </w:r>
+    </w:p>
+    <w:p>
+      <w:pPr>
+        <w:pStyle w:val="Compact"/>
+        <w:numPr>
+          <w:ilvl w:val="0"/>
+          <w:numId w:val="1076"/>
+        </w:numPr>
+      </w:pPr>
+      <w:r>
+        <w:t xml:space="preserve">All blocking review findings have been resolved or explicitly deferred to a tracked follow-up issue.</w:t>
+      </w:r>
+    </w:p>
+    <w:p>
+      <w:pPr>
+        <w:pStyle w:val="Compact"/>
+        <w:numPr>
+          <w:ilvl w:val="0"/>
+          <w:numId w:val="1076"/>
         </w:numPr>
       </w:pPr>
       <w:r>
@@ -40135,15 +40543,15 @@
         <w:t xml:space="preserve">.</w:t>
       </w:r>
     </w:p>
-    <w:bookmarkEnd w:id="338"/>
-    <w:bookmarkEnd w:id="339"/>
-    <w:bookmarkStart w:id="342" w:name="sec-getting-help-with-code"/>
+    <w:bookmarkEnd w:id="341"/>
+    <w:bookmarkEnd w:id="342"/>
+    <w:bookmarkStart w:id="345" w:name="sec-getting-help-with-code"/>
     <w:p>
       <w:pPr>
         <w:pStyle w:val="Heading2"/>
       </w:pPr>
       <w:r>
-        <w:t xml:space="preserve">47 Getting Help with Code</w:t>
+        <w:t xml:space="preserve">48 Getting Help with Code</w:t>
       </w:r>
     </w:p>
     <w:p>
@@ -40229,95 +40637,6 @@
       </w:r>
       <w:r>
         <w:t xml:space="preserve">:</w:t>
-      </w:r>
-    </w:p>
-    <w:p>
-      <w:pPr>
-        <w:pStyle w:val="Compact"/>
-        <w:numPr>
-          <w:ilvl w:val="0"/>
-          <w:numId w:val="1076"/>
-        </w:numPr>
-      </w:pPr>
-      <w:r>
-        <w:t xml:space="preserve">Is</w:t>
-      </w:r>
-      <w:r>
-        <w:t xml:space="preserve"> </w:t>
-      </w:r>
-      <w:r>
-        <w:rPr>
-          <w:b/>
-          <w:bCs/>
-        </w:rPr>
-        <w:t xml:space="preserve">reproducible</w:t>
-      </w:r>
-      <w:r>
-        <w:t xml:space="preserve">: Contains all necessary code, including</w:t>
-      </w:r>
-      <w:r>
-        <w:t xml:space="preserve"> </w:t>
-      </w:r>
-      <w:r>
-        <w:rPr>
-          <w:rStyle w:val="VerbatimChar"/>
-        </w:rPr>
-        <w:t xml:space="preserve">library()</w:t>
-      </w:r>
-      <w:r>
-        <w:t xml:space="preserve"> </w:t>
-      </w:r>
-      <w:r>
-        <w:t xml:space="preserve">calls and data</w:t>
-      </w:r>
-    </w:p>
-    <w:p>
-      <w:pPr>
-        <w:pStyle w:val="Compact"/>
-        <w:numPr>
-          <w:ilvl w:val="0"/>
-          <w:numId w:val="1076"/>
-        </w:numPr>
-      </w:pPr>
-      <w:r>
-        <w:t xml:space="preserve">Is</w:t>
-      </w:r>
-      <w:r>
-        <w:t xml:space="preserve"> </w:t>
-      </w:r>
-      <w:r>
-        <w:rPr>
-          <w:b/>
-          <w:bCs/>
-        </w:rPr>
-        <w:t xml:space="preserve">minimal</w:t>
-      </w:r>
-      <w:r>
-        <w:t xml:space="preserve">: Strips away everything not directly related to your problem</w:t>
-      </w:r>
-    </w:p>
-    <w:p>
-      <w:pPr>
-        <w:pStyle w:val="Compact"/>
-        <w:numPr>
-          <w:ilvl w:val="0"/>
-          <w:numId w:val="1076"/>
-        </w:numPr>
-      </w:pPr>
-      <w:r>
-        <w:t xml:space="preserve">Uses small, simple example data (often built-in datasets)</w:t>
-      </w:r>
-    </w:p>
-    <w:p>
-      <w:pPr>
-        <w:pStyle w:val="FirstParagraph"/>
-      </w:pPr>
-      <w:r>
-        <w:rPr>
-          <w:b/>
-          <w:bCs/>
-        </w:rPr>
-        <w:t xml:space="preserve">Why create a reprex:</w:t>
       </w:r>
     </w:p>
     <w:p>
@@ -40329,7 +40648,35 @@
         </w:numPr>
       </w:pPr>
       <w:r>
-        <w:t xml:space="preserve">80% of the time, creating a reprex helps you discover the solution yourself</w:t>
+        <w:t xml:space="preserve">Is</w:t>
+      </w:r>
+      <w:r>
+        <w:t xml:space="preserve"> </w:t>
+      </w:r>
+      <w:r>
+        <w:rPr>
+          <w:b/>
+          <w:bCs/>
+        </w:rPr>
+        <w:t xml:space="preserve">reproducible</w:t>
+      </w:r>
+      <w:r>
+        <w:t xml:space="preserve">: Contains all necessary code, including</w:t>
+      </w:r>
+      <w:r>
+        <w:t xml:space="preserve"> </w:t>
+      </w:r>
+      <w:r>
+        <w:rPr>
+          <w:rStyle w:val="VerbatimChar"/>
+        </w:rPr>
+        <w:t xml:space="preserve">library()</w:t>
+      </w:r>
+      <w:r>
+        <w:t xml:space="preserve"> </w:t>
+      </w:r>
+      <w:r>
+        <w:t xml:space="preserve">calls and data</w:t>
       </w:r>
     </w:p>
     <w:p>
@@ -40341,7 +40688,20 @@
         </w:numPr>
       </w:pPr>
       <w:r>
-        <w:t xml:space="preserve">20% of the time, you’ll have a clear example that makes it easy for others to help you</w:t>
+        <w:t xml:space="preserve">Is</w:t>
+      </w:r>
+      <w:r>
+        <w:t xml:space="preserve"> </w:t>
+      </w:r>
+      <w:r>
+        <w:rPr>
+          <w:b/>
+          <w:bCs/>
+        </w:rPr>
+        <w:t xml:space="preserve">minimal</w:t>
+      </w:r>
+      <w:r>
+        <w:t xml:space="preserve">: Strips away everything not directly related to your problem</w:t>
       </w:r>
     </w:p>
     <w:p>
@@ -40353,7 +40713,7 @@
         </w:numPr>
       </w:pPr>
       <w:r>
-        <w:t xml:space="preserve">It respects others’ time by making your problem easy to understand and reproduce</w:t>
+        <w:t xml:space="preserve">Uses small, simple example data (often built-in datasets)</w:t>
       </w:r>
     </w:p>
     <w:p>
@@ -40365,7 +40725,7 @@
           <w:b/>
           <w:bCs/>
         </w:rPr>
-        <w:t xml:space="preserve">Resources:</w:t>
+        <w:t xml:space="preserve">Why create a reprex:</w:t>
       </w:r>
     </w:p>
     <w:p>
@@ -40376,7 +40736,55 @@
           <w:numId w:val="1078"/>
         </w:numPr>
       </w:pPr>
-      <w:hyperlink r:id="rId340">
+      <w:r>
+        <w:t xml:space="preserve">80% of the time, creating a reprex helps you discover the solution yourself</w:t>
+      </w:r>
+    </w:p>
+    <w:p>
+      <w:pPr>
+        <w:pStyle w:val="Compact"/>
+        <w:numPr>
+          <w:ilvl w:val="0"/>
+          <w:numId w:val="1078"/>
+        </w:numPr>
+      </w:pPr>
+      <w:r>
+        <w:t xml:space="preserve">20% of the time, you’ll have a clear example that makes it easy for others to help you</w:t>
+      </w:r>
+    </w:p>
+    <w:p>
+      <w:pPr>
+        <w:pStyle w:val="Compact"/>
+        <w:numPr>
+          <w:ilvl w:val="0"/>
+          <w:numId w:val="1078"/>
+        </w:numPr>
+      </w:pPr>
+      <w:r>
+        <w:t xml:space="preserve">It respects others’ time by making your problem easy to understand and reproduce</w:t>
+      </w:r>
+    </w:p>
+    <w:p>
+      <w:pPr>
+        <w:pStyle w:val="FirstParagraph"/>
+      </w:pPr>
+      <w:r>
+        <w:rPr>
+          <w:b/>
+          <w:bCs/>
+        </w:rPr>
+        <w:t xml:space="preserve">Resources:</w:t>
+      </w:r>
+    </w:p>
+    <w:p>
+      <w:pPr>
+        <w:pStyle w:val="Compact"/>
+        <w:numPr>
+          <w:ilvl w:val="0"/>
+          <w:numId w:val="1079"/>
+        </w:numPr>
+      </w:pPr>
+      <w:hyperlink r:id="rId343">
         <w:r>
           <w:rPr>
             <w:rStyle w:val="VerbatimChar"/>
@@ -40396,10 +40804,10 @@
         <w:pStyle w:val="Compact"/>
         <w:numPr>
           <w:ilvl w:val="0"/>
-          <w:numId w:val="1078"/>
+          <w:numId w:val="1079"/>
         </w:numPr>
       </w:pPr>
-      <w:hyperlink r:id="rId341">
+      <w:hyperlink r:id="rId344">
         <w:r>
           <w:rPr>
             <w:rStyle w:val="Hyperlink"/>
@@ -40417,23 +40825,23 @@
         <w:t xml:space="preserve">: Step-by-step guide to creating effective reproducible examples</w:t>
       </w:r>
     </w:p>
-    <w:bookmarkEnd w:id="342"/>
-    <w:bookmarkStart w:id="404" w:name="sec-r-resources"/>
+    <w:bookmarkEnd w:id="345"/>
+    <w:bookmarkStart w:id="408" w:name="sec-r-resources"/>
     <w:p>
       <w:pPr>
         <w:pStyle w:val="Heading2"/>
       </w:pPr>
       <w:r>
-        <w:t xml:space="preserve">48 Additional Resources</w:t>
-      </w:r>
-    </w:p>
-    <w:bookmarkStart w:id="349" w:name="learning-r"/>
+        <w:t xml:space="preserve">49 Additional Resources</w:t>
+      </w:r>
+    </w:p>
+    <w:bookmarkStart w:id="352" w:name="learning-r"/>
     <w:p>
       <w:pPr>
         <w:pStyle w:val="Heading3"/>
       </w:pPr>
       <w:r>
-        <w:t xml:space="preserve">48.1 Learning R</w:t>
+        <w:t xml:space="preserve">49.1 Learning R</w:t>
       </w:r>
     </w:p>
     <w:p>
@@ -40441,7 +40849,7 @@
         <w:pStyle w:val="Compact"/>
         <w:numPr>
           <w:ilvl w:val="0"/>
-          <w:numId w:val="1079"/>
+          <w:numId w:val="1080"/>
         </w:numPr>
       </w:pPr>
       <w:r>
@@ -40465,10 +40873,10 @@
         <w:pStyle w:val="Compact"/>
         <w:numPr>
           <w:ilvl w:val="0"/>
-          <w:numId w:val="1079"/>
+          <w:numId w:val="1080"/>
         </w:numPr>
       </w:pPr>
-      <w:hyperlink r:id="rId343">
+      <w:hyperlink r:id="rId346">
         <w:r>
           <w:rPr>
             <w:rStyle w:val="Hyperlink"/>
@@ -40488,10 +40896,10 @@
         <w:pStyle w:val="Compact"/>
         <w:numPr>
           <w:ilvl w:val="0"/>
-          <w:numId w:val="1079"/>
+          <w:numId w:val="1080"/>
         </w:numPr>
       </w:pPr>
-      <w:hyperlink r:id="rId344">
+      <w:hyperlink r:id="rId347">
         <w:r>
           <w:rPr>
             <w:rStyle w:val="Hyperlink"/>
@@ -40511,10 +40919,10 @@
         <w:pStyle w:val="Compact"/>
         <w:numPr>
           <w:ilvl w:val="0"/>
-          <w:numId w:val="1079"/>
+          <w:numId w:val="1080"/>
         </w:numPr>
       </w:pPr>
-      <w:hyperlink r:id="rId345">
+      <w:hyperlink r:id="rId348">
         <w:r>
           <w:rPr>
             <w:rStyle w:val="Hyperlink"/>
@@ -40549,10 +40957,10 @@
         <w:pStyle w:val="Compact"/>
         <w:numPr>
           <w:ilvl w:val="0"/>
-          <w:numId w:val="1079"/>
+          <w:numId w:val="1080"/>
         </w:numPr>
       </w:pPr>
-      <w:hyperlink r:id="rId346">
+      <w:hyperlink r:id="rId349">
         <w:r>
           <w:rPr>
             <w:rStyle w:val="Hyperlink"/>
@@ -40572,10 +40980,10 @@
         <w:pStyle w:val="Compact"/>
         <w:numPr>
           <w:ilvl w:val="0"/>
-          <w:numId w:val="1079"/>
+          <w:numId w:val="1080"/>
         </w:numPr>
       </w:pPr>
-      <w:hyperlink r:id="rId347">
+      <w:hyperlink r:id="rId350">
         <w:r>
           <w:rPr>
             <w:rStyle w:val="Hyperlink"/>
@@ -40595,10 +41003,10 @@
         <w:pStyle w:val="Compact"/>
         <w:numPr>
           <w:ilvl w:val="0"/>
-          <w:numId w:val="1079"/>
+          <w:numId w:val="1080"/>
         </w:numPr>
       </w:pPr>
-      <w:hyperlink r:id="rId348">
+      <w:hyperlink r:id="rId351">
         <w:r>
           <w:rPr>
             <w:rStyle w:val="Hyperlink"/>
@@ -40613,14 +41021,14 @@
         <w:t xml:space="preserve">- short, task-focused R code snippets</w:t>
       </w:r>
     </w:p>
-    <w:bookmarkEnd w:id="349"/>
-    <w:bookmarkStart w:id="351" w:name="learning-python"/>
+    <w:bookmarkEnd w:id="352"/>
+    <w:bookmarkStart w:id="354" w:name="learning-python"/>
     <w:p>
       <w:pPr>
         <w:pStyle w:val="Heading3"/>
       </w:pPr>
       <w:r>
-        <w:t xml:space="preserve">48.2 Learning Python</w:t>
+        <w:t xml:space="preserve">49.2 Learning Python</w:t>
       </w:r>
     </w:p>
     <w:p>
@@ -40628,10 +41036,10 @@
         <w:pStyle w:val="Compact"/>
         <w:numPr>
           <w:ilvl w:val="0"/>
-          <w:numId w:val="1080"/>
+          <w:numId w:val="1081"/>
         </w:numPr>
       </w:pPr>
-      <w:hyperlink r:id="rId350">
+      <w:hyperlink r:id="rId353">
         <w:r>
           <w:rPr>
             <w:rStyle w:val="Hyperlink"/>
@@ -40658,14 +41066,14 @@
         <w:t xml:space="preserve">it visualizes Python, Java, C, C++ and JavaScript (not R) and limits program length, so use it on small examples</w:t>
       </w:r>
     </w:p>
-    <w:bookmarkEnd w:id="351"/>
-    <w:bookmarkStart w:id="356" w:name="coming-to-r-from-sas"/>
+    <w:bookmarkEnd w:id="354"/>
+    <w:bookmarkStart w:id="359" w:name="coming-to-r-from-sas"/>
     <w:p>
       <w:pPr>
         <w:pStyle w:val="Heading3"/>
       </w:pPr>
       <w:r>
-        <w:t xml:space="preserve">48.3 Coming to R from SAS</w:t>
+        <w:t xml:space="preserve">49.3 Coming to R from SAS</w:t>
       </w:r>
     </w:p>
     <w:p>
@@ -40673,10 +41081,10 @@
         <w:pStyle w:val="Compact"/>
         <w:numPr>
           <w:ilvl w:val="0"/>
-          <w:numId w:val="1081"/>
+          <w:numId w:val="1082"/>
         </w:numPr>
       </w:pPr>
-      <w:hyperlink r:id="rId352">
+      <w:hyperlink r:id="rId355">
         <w:r>
           <w:rPr>
             <w:rStyle w:val="Hyperlink"/>
@@ -40699,7 +41107,7 @@
       <w:r>
         <w:t xml:space="preserve"> </w:t>
       </w:r>
-      <w:hyperlink r:id="rId353">
+      <w:hyperlink r:id="rId356">
         <w:r>
           <w:rPr>
             <w:rStyle w:val="VerbatimChar"/>
@@ -40773,10 +41181,10 @@
         <w:pStyle w:val="Compact"/>
         <w:numPr>
           <w:ilvl w:val="0"/>
-          <w:numId w:val="1081"/>
+          <w:numId w:val="1082"/>
         </w:numPr>
       </w:pPr>
-      <w:hyperlink r:id="rId354">
+      <w:hyperlink r:id="rId357">
         <w:r>
           <w:rPr>
             <w:rStyle w:val="Hyperlink"/>
@@ -40796,10 +41204,10 @@
         <w:pStyle w:val="Compact"/>
         <w:numPr>
           <w:ilvl w:val="0"/>
-          <w:numId w:val="1081"/>
+          <w:numId w:val="1082"/>
         </w:numPr>
       </w:pPr>
-      <w:hyperlink r:id="rId355">
+      <w:hyperlink r:id="rId358">
         <w:r>
           <w:rPr>
             <w:rStyle w:val="Hyperlink"/>
@@ -40814,14 +41222,14 @@
         <w:t xml:space="preserve">(Kleinman and Horton) - side-by-side SAS and R code for data management and analysis</w:t>
       </w:r>
     </w:p>
-    <w:bookmarkEnd w:id="356"/>
-    <w:bookmarkStart w:id="363" w:name="general-r-programming"/>
+    <w:bookmarkEnd w:id="359"/>
+    <w:bookmarkStart w:id="366" w:name="general-r-programming"/>
     <w:p>
       <w:pPr>
         <w:pStyle w:val="Heading3"/>
       </w:pPr>
       <w:r>
-        <w:t xml:space="preserve">48.4 General R Programming</w:t>
+        <w:t xml:space="preserve">49.4 General R Programming</w:t>
       </w:r>
     </w:p>
     <w:p>
@@ -40829,7 +41237,7 @@
         <w:pStyle w:val="Compact"/>
         <w:numPr>
           <w:ilvl w:val="0"/>
-          <w:numId w:val="1082"/>
+          <w:numId w:val="1083"/>
         </w:numPr>
       </w:pPr>
       <w:r>
@@ -40850,7 +41258,7 @@
       <w:r>
         <w:t xml:space="preserve"> </w:t>
       </w:r>
-      <w:hyperlink r:id="rId357">
+      <w:hyperlink r:id="rId360">
         <w:r>
           <w:rPr>
             <w:rStyle w:val="Hyperlink"/>
@@ -40864,7 +41272,7 @@
       <w:r>
         <w:t xml:space="preserve"> </w:t>
       </w:r>
-      <w:hyperlink r:id="rId358">
+      <w:hyperlink r:id="rId361">
         <w:r>
           <w:rPr>
             <w:rStyle w:val="Hyperlink"/>
@@ -40884,7 +41292,7 @@
       <w:r>
         <w:t xml:space="preserve"> </w:t>
       </w:r>
-      <w:hyperlink r:id="rId359">
+      <w:hyperlink r:id="rId362">
         <w:r>
           <w:rPr>
             <w:rStyle w:val="Hyperlink"/>
@@ -40898,10 +41306,10 @@
         <w:pStyle w:val="Compact"/>
         <w:numPr>
           <w:ilvl w:val="0"/>
-          <w:numId w:val="1082"/>
+          <w:numId w:val="1083"/>
         </w:numPr>
       </w:pPr>
-      <w:hyperlink r:id="rId360">
+      <w:hyperlink r:id="rId363">
         <w:r>
           <w:rPr>
             <w:rStyle w:val="Hyperlink"/>
@@ -40927,10 +41335,10 @@
         <w:pStyle w:val="Compact"/>
         <w:numPr>
           <w:ilvl w:val="0"/>
-          <w:numId w:val="1082"/>
+          <w:numId w:val="1083"/>
         </w:numPr>
       </w:pPr>
-      <w:hyperlink r:id="rId361">
+      <w:hyperlink r:id="rId364">
         <w:r>
           <w:rPr>
             <w:rStyle w:val="Hyperlink"/>
@@ -41004,10 +41412,10 @@
         <w:pStyle w:val="Compact"/>
         <w:numPr>
           <w:ilvl w:val="0"/>
-          <w:numId w:val="1082"/>
+          <w:numId w:val="1083"/>
         </w:numPr>
       </w:pPr>
-      <w:hyperlink r:id="rId362">
+      <w:hyperlink r:id="rId365">
         <w:r>
           <w:rPr>
             <w:rStyle w:val="Hyperlink"/>
@@ -41022,14 +41430,14 @@
         <w:t xml:space="preserve">- spatial data analysis in R</w:t>
       </w:r>
     </w:p>
-    <w:bookmarkEnd w:id="363"/>
-    <w:bookmarkStart w:id="366" w:name="summary-tables"/>
+    <w:bookmarkEnd w:id="366"/>
+    <w:bookmarkStart w:id="369" w:name="summary-tables"/>
     <w:p>
       <w:pPr>
         <w:pStyle w:val="Heading3"/>
       </w:pPr>
       <w:r>
-        <w:t xml:space="preserve">48.5 Summary tables</w:t>
+        <w:t xml:space="preserve">49.5 Summary tables</w:t>
       </w:r>
     </w:p>
     <w:p>
@@ -41037,7 +41445,7 @@
         <w:pStyle w:val="Compact"/>
         <w:numPr>
           <w:ilvl w:val="0"/>
-          <w:numId w:val="1083"/>
+          <w:numId w:val="1084"/>
         </w:numPr>
       </w:pPr>
       <w:hyperlink r:id="rId140">
@@ -41060,10 +41468,10 @@
         <w:pStyle w:val="Compact"/>
         <w:numPr>
           <w:ilvl w:val="0"/>
-          <w:numId w:val="1083"/>
+          <w:numId w:val="1084"/>
         </w:numPr>
       </w:pPr>
-      <w:hyperlink r:id="rId364">
+      <w:hyperlink r:id="rId367">
         <w:r>
           <w:rPr>
             <w:rStyle w:val="VerbatimChar"/>
@@ -41095,10 +41503,10 @@
         <w:pStyle w:val="Compact"/>
         <w:numPr>
           <w:ilvl w:val="0"/>
-          <w:numId w:val="1083"/>
+          <w:numId w:val="1084"/>
         </w:numPr>
       </w:pPr>
-      <w:hyperlink r:id="rId365">
+      <w:hyperlink r:id="rId368">
         <w:r>
           <w:rPr>
             <w:rStyle w:val="VerbatimChar"/>
@@ -41118,7 +41526,7 @@
         <w:pStyle w:val="Compact"/>
         <w:numPr>
           <w:ilvl w:val="0"/>
-          <w:numId w:val="1083"/>
+          <w:numId w:val="1084"/>
         </w:numPr>
       </w:pPr>
       <w:r>
@@ -41146,14 +41554,14 @@
         <w:t xml:space="preserve">above) - SAS-style frequency and means tables</w:t>
       </w:r>
     </w:p>
-    <w:bookmarkEnd w:id="366"/>
-    <w:bookmarkStart w:id="371" w:name="r-package-development"/>
+    <w:bookmarkEnd w:id="369"/>
+    <w:bookmarkStart w:id="374" w:name="r-package-development"/>
     <w:p>
       <w:pPr>
         <w:pStyle w:val="Heading3"/>
       </w:pPr>
       <w:r>
-        <w:t xml:space="preserve">48.6 R Package Development</w:t>
+        <w:t xml:space="preserve">49.6 R Package Development</w:t>
       </w:r>
     </w:p>
     <w:p>
@@ -41161,7 +41569,7 @@
         <w:pStyle w:val="Compact"/>
         <w:numPr>
           <w:ilvl w:val="0"/>
-          <w:numId w:val="1084"/>
+          <w:numId w:val="1085"/>
         </w:numPr>
       </w:pPr>
       <w:r>
@@ -41185,7 +41593,7 @@
         <w:pStyle w:val="Compact"/>
         <w:numPr>
           <w:ilvl w:val="0"/>
-          <w:numId w:val="1084"/>
+          <w:numId w:val="1085"/>
         </w:numPr>
       </w:pPr>
       <w:r>
@@ -41209,7 +41617,7 @@
         <w:pStyle w:val="Compact"/>
         <w:numPr>
           <w:ilvl w:val="0"/>
-          <w:numId w:val="1084"/>
+          <w:numId w:val="1085"/>
         </w:numPr>
       </w:pPr>
       <w:hyperlink r:id="rId36">
@@ -41232,7 +41640,7 @@
         <w:pStyle w:val="Compact"/>
         <w:numPr>
           <w:ilvl w:val="0"/>
-          <w:numId w:val="1084"/>
+          <w:numId w:val="1085"/>
         </w:numPr>
       </w:pPr>
       <w:hyperlink r:id="rId37">
@@ -41255,7 +41663,7 @@
         <w:pStyle w:val="Compact"/>
         <w:numPr>
           <w:ilvl w:val="0"/>
-          <w:numId w:val="1084"/>
+          <w:numId w:val="1085"/>
         </w:numPr>
       </w:pPr>
       <w:hyperlink r:id="rId23">
@@ -41278,7 +41686,7 @@
         <w:pStyle w:val="Compact"/>
         <w:numPr>
           <w:ilvl w:val="0"/>
-          <w:numId w:val="1084"/>
+          <w:numId w:val="1085"/>
         </w:numPr>
       </w:pPr>
       <w:hyperlink r:id="rId39">
@@ -41301,10 +41709,10 @@
         <w:pStyle w:val="Compact"/>
         <w:numPr>
           <w:ilvl w:val="0"/>
-          <w:numId w:val="1084"/>
+          <w:numId w:val="1085"/>
         </w:numPr>
       </w:pPr>
-      <w:hyperlink r:id="rId367">
+      <w:hyperlink r:id="rId370">
         <w:r>
           <w:rPr>
             <w:rStyle w:val="Hyperlink"/>
@@ -41321,7 +41729,7 @@
       <w:r>
         <w:t xml:space="preserve"> </w:t>
       </w:r>
-      <w:hyperlink r:id="rId368">
+      <w:hyperlink r:id="rId371">
         <w:r>
           <w:rPr>
             <w:rStyle w:val="Hyperlink"/>
@@ -41344,7 +41752,7 @@
       <w:r>
         <w:t xml:space="preserve"> </w:t>
       </w:r>
-      <w:hyperlink r:id="rId369">
+      <w:hyperlink r:id="rId372">
         <w:r>
           <w:rPr>
             <w:rStyle w:val="Hyperlink"/>
@@ -41361,10 +41769,10 @@
         <w:pStyle w:val="Compact"/>
         <w:numPr>
           <w:ilvl w:val="0"/>
-          <w:numId w:val="1084"/>
+          <w:numId w:val="1085"/>
         </w:numPr>
       </w:pPr>
-      <w:hyperlink r:id="rId370">
+      <w:hyperlink r:id="rId373">
         <w:r>
           <w:rPr>
             <w:rStyle w:val="Hyperlink"/>
@@ -41379,72 +41787,14 @@
         <w:t xml:space="preserve">- getting involved with base R itself</w:t>
       </w:r>
     </w:p>
-    <w:bookmarkEnd w:id="371"/>
-    <w:bookmarkStart w:id="372" w:name="shiny-development"/>
+    <w:bookmarkEnd w:id="374"/>
+    <w:bookmarkStart w:id="375" w:name="shiny-development"/>
     <w:p>
       <w:pPr>
         <w:pStyle w:val="Heading3"/>
       </w:pPr>
       <w:r>
-        <w:t xml:space="preserve">48.7 Shiny Development</w:t>
-      </w:r>
-    </w:p>
-    <w:p>
-      <w:pPr>
-        <w:pStyle w:val="Compact"/>
-        <w:numPr>
-          <w:ilvl w:val="0"/>
-          <w:numId w:val="1085"/>
-        </w:numPr>
-      </w:pPr>
-      <w:r>
-        <w:t xml:space="preserve">Mastering Shiny</w:t>
-      </w:r>
-      <w:r>
-        <w:t xml:space="preserve"> </w:t>
-      </w:r>
-      <w:r>
-        <w:t xml:space="preserve">(Wickham 2021)</w:t>
-      </w:r>
-      <w:r>
-        <w:t xml:space="preserve"> </w:t>
-      </w:r>
-      <w:r>
-        <w:t xml:space="preserve">- comprehensive guide to building web applications with Shiny</w:t>
-      </w:r>
-    </w:p>
-    <w:p>
-      <w:pPr>
-        <w:pStyle w:val="Compact"/>
-        <w:numPr>
-          <w:ilvl w:val="0"/>
-          <w:numId w:val="1085"/>
-        </w:numPr>
-      </w:pPr>
-      <w:r>
-        <w:t xml:space="preserve">Engineering Production-Grade Shiny Apps</w:t>
-      </w:r>
-      <w:r>
-        <w:t xml:space="preserve"> </w:t>
-      </w:r>
-      <w:r>
-        <w:t xml:space="preserve">(Fay et al. 2021)</w:t>
-      </w:r>
-      <w:r>
-        <w:t xml:space="preserve"> </w:t>
-      </w:r>
-      <w:r>
-        <w:t xml:space="preserve">- best practices for production Shiny applications</w:t>
-      </w:r>
-    </w:p>
-    <w:bookmarkEnd w:id="372"/>
-    <w:bookmarkStart w:id="403" w:name="git-and-version-control"/>
-    <w:p>
-      <w:pPr>
-        <w:pStyle w:val="Heading3"/>
-      </w:pPr>
-      <w:r>
-        <w:t xml:space="preserve">48.8 Git and Version Control</w:t>
+        <w:t xml:space="preserve">49.7 Shiny Development</w:t>
       </w:r>
     </w:p>
     <w:p>
@@ -41456,19 +41806,19 @@
         </w:numPr>
       </w:pPr>
       <w:r>
-        <w:t xml:space="preserve">Happy Git and GitHub for the useR</w:t>
-      </w:r>
-      <w:r>
-        <w:t xml:space="preserve"> </w:t>
-      </w:r>
-      <w:r>
-        <w:t xml:space="preserve">(Bryan 2023)</w:t>
-      </w:r>
-      <w:r>
-        <w:t xml:space="preserve"> </w:t>
-      </w:r>
-      <w:r>
-        <w:t xml:space="preserve">- essential guide to using Git and GitHub with R</w:t>
+        <w:t xml:space="preserve">Mastering Shiny</w:t>
+      </w:r>
+      <w:r>
+        <w:t xml:space="preserve"> </w:t>
+      </w:r>
+      <w:r>
+        <w:t xml:space="preserve">(Wickham 2021)</w:t>
+      </w:r>
+      <w:r>
+        <w:t xml:space="preserve"> </w:t>
+      </w:r>
+      <w:r>
+        <w:t xml:space="preserve">- comprehensive guide to building web applications with Shiny</w:t>
       </w:r>
     </w:p>
     <w:p>
@@ -41479,7 +41829,65 @@
           <w:numId w:val="1086"/>
         </w:numPr>
       </w:pPr>
-      <w:hyperlink r:id="rId373">
+      <w:r>
+        <w:t xml:space="preserve">Engineering Production-Grade Shiny Apps</w:t>
+      </w:r>
+      <w:r>
+        <w:t xml:space="preserve"> </w:t>
+      </w:r>
+      <w:r>
+        <w:t xml:space="preserve">(Fay et al. 2021)</w:t>
+      </w:r>
+      <w:r>
+        <w:t xml:space="preserve"> </w:t>
+      </w:r>
+      <w:r>
+        <w:t xml:space="preserve">- best practices for production Shiny applications</w:t>
+      </w:r>
+    </w:p>
+    <w:bookmarkEnd w:id="375"/>
+    <w:bookmarkStart w:id="407" w:name="git-and-version-control"/>
+    <w:p>
+      <w:pPr>
+        <w:pStyle w:val="Heading3"/>
+      </w:pPr>
+      <w:r>
+        <w:t xml:space="preserve">49.8 Git and Version Control</w:t>
+      </w:r>
+    </w:p>
+    <w:p>
+      <w:pPr>
+        <w:pStyle w:val="Compact"/>
+        <w:numPr>
+          <w:ilvl w:val="0"/>
+          <w:numId w:val="1087"/>
+        </w:numPr>
+      </w:pPr>
+      <w:r>
+        <w:t xml:space="preserve">Happy Git and GitHub for the useR</w:t>
+      </w:r>
+      <w:r>
+        <w:t xml:space="preserve"> </w:t>
+      </w:r>
+      <w:r>
+        <w:t xml:space="preserve">(Bryan 2023)</w:t>
+      </w:r>
+      <w:r>
+        <w:t xml:space="preserve"> </w:t>
+      </w:r>
+      <w:r>
+        <w:t xml:space="preserve">- essential guide to using Git and GitHub with R</w:t>
+      </w:r>
+    </w:p>
+    <w:p>
+      <w:pPr>
+        <w:pStyle w:val="Compact"/>
+        <w:numPr>
+          <w:ilvl w:val="0"/>
+          <w:numId w:val="1087"/>
+        </w:numPr>
+      </w:pPr>
+      <w:hyperlink r:id="rId376">
         <w:r>
           <w:rPr>
             <w:rStyle w:val="Hyperlink"/>
@@ -41526,10 +41934,10 @@
         <w:pStyle w:val="Compact"/>
         <w:numPr>
           <w:ilvl w:val="0"/>
-          <w:numId w:val="1086"/>
+          <w:numId w:val="1087"/>
         </w:numPr>
       </w:pPr>
-      <w:hyperlink r:id="rId374">
+      <w:hyperlink r:id="rId377">
         <w:r>
           <w:rPr>
             <w:rStyle w:val="Hyperlink"/>
@@ -41549,10 +41957,10 @@
         <w:pStyle w:val="Compact"/>
         <w:numPr>
           <w:ilvl w:val="0"/>
-          <w:numId w:val="1086"/>
+          <w:numId w:val="1087"/>
         </w:numPr>
       </w:pPr>
-      <w:hyperlink r:id="rId375">
+      <w:hyperlink r:id="rId378">
         <w:r>
           <w:rPr>
             <w:rStyle w:val="VerbatimChar"/>
@@ -41572,10 +41980,10 @@
         <w:pStyle w:val="Compact"/>
         <w:numPr>
           <w:ilvl w:val="0"/>
-          <w:numId w:val="1086"/>
+          <w:numId w:val="1087"/>
         </w:numPr>
       </w:pPr>
-      <w:hyperlink r:id="rId376">
+      <w:hyperlink r:id="rId379">
         <w:r>
           <w:rPr>
             <w:rStyle w:val="Hyperlink"/>
@@ -41595,10 +42003,10 @@
         <w:pStyle w:val="Compact"/>
         <w:numPr>
           <w:ilvl w:val="0"/>
-          <w:numId w:val="1086"/>
+          <w:numId w:val="1087"/>
         </w:numPr>
       </w:pPr>
-      <w:hyperlink r:id="rId377">
+      <w:hyperlink r:id="rId380">
         <w:r>
           <w:rPr>
             <w:rStyle w:val="VerbatimChar"/>
@@ -41619,8 +42027,8 @@
         <w:t xml:space="preserve">organized by patterns like tags or issues</w:t>
       </w:r>
     </w:p>
-    <w:bookmarkStart w:id="402" w:name="refs"/>
-    <w:bookmarkStart w:id="379" w:name="ref-bryan2023happygit"/>
+    <w:bookmarkStart w:id="406" w:name="refs"/>
+    <w:bookmarkStart w:id="382" w:name="ref-bryan2023happygit"/>
     <w:p>
       <w:pPr>
         <w:pStyle w:val="Bibliography"/>
@@ -41644,7 +42052,7 @@
       <w:r>
         <w:t xml:space="preserve"> </w:t>
       </w:r>
-      <w:hyperlink r:id="rId378">
+      <w:hyperlink r:id="rId381">
         <w:r>
           <w:rPr>
             <w:rStyle w:val="Hyperlink"/>
@@ -41656,8 +42064,8 @@
         <w:t xml:space="preserve">.</w:t>
       </w:r>
     </w:p>
-    <w:bookmarkEnd w:id="379"/>
-    <w:bookmarkStart w:id="380" w:name="ref-reprex"/>
+    <w:bookmarkEnd w:id="382"/>
+    <w:bookmarkStart w:id="383" w:name="ref-reprex"/>
     <w:p>
       <w:pPr>
         <w:pStyle w:val="Bibliography"/>
@@ -41681,7 +42089,7 @@
       <w:r>
         <w:t xml:space="preserve"> </w:t>
       </w:r>
-      <w:hyperlink r:id="rId340">
+      <w:hyperlink r:id="rId343">
         <w:r>
           <w:rPr>
             <w:rStyle w:val="Hyperlink"/>
@@ -41693,8 +42101,8 @@
         <w:t xml:space="preserve">.</w:t>
       </w:r>
     </w:p>
-    <w:bookmarkEnd w:id="380"/>
-    <w:bookmarkStart w:id="382" w:name="ref-fay2021engineering"/>
+    <w:bookmarkEnd w:id="383"/>
+    <w:bookmarkStart w:id="385" w:name="ref-fay2021engineering"/>
     <w:p>
       <w:pPr>
         <w:pStyle w:val="Bibliography"/>
@@ -41718,7 +42126,7 @@
       <w:r>
         <w:t xml:space="preserve"> </w:t>
       </w:r>
-      <w:hyperlink r:id="rId381">
+      <w:hyperlink r:id="rId384">
         <w:r>
           <w:rPr>
             <w:rStyle w:val="Hyperlink"/>
@@ -41730,8 +42138,38 @@
         <w:t xml:space="preserve">.</w:t>
       </w:r>
     </w:p>
-    <w:bookmarkEnd w:id="382"/>
-    <w:bookmarkStart w:id="384" w:name="ref-parnas1972criteria"/>
+    <w:bookmarkEnd w:id="385"/>
+    <w:bookmarkStart w:id="386" w:name="ref-matloff-tidyverse-skeptic"/>
+    <w:p>
+      <w:pPr>
+        <w:pStyle w:val="Bibliography"/>
+      </w:pPr>
+      <w:r>
+        <w:t xml:space="preserve">Matloff, Norm. 2019.</w:t>
+      </w:r>
+      <w:r>
+        <w:t xml:space="preserve"> </w:t>
+      </w:r>
+      <w:r>
+        <w:t xml:space="preserve">“Tidyverse Skeptic: Why the Tidyverse Is Not a Good Vehicle for Teaching Noncoders.”</w:t>
+      </w:r>
+      <w:r>
+        <w:t xml:space="preserve"> </w:t>
+      </w:r>
+      <w:hyperlink r:id="rId322">
+        <w:r>
+          <w:rPr>
+            <w:rStyle w:val="Hyperlink"/>
+          </w:rPr>
+          <w:t xml:space="preserve">https://matloff.github.io/TidyverseSkeptic/Skeptic.html</w:t>
+        </w:r>
+      </w:hyperlink>
+      <w:r>
+        <w:t xml:space="preserve">.</w:t>
+      </w:r>
+    </w:p>
+    <w:bookmarkEnd w:id="386"/>
+    <w:bookmarkStart w:id="388" w:name="ref-parnas1972criteria"/>
     <w:p>
       <w:pPr>
         <w:pStyle w:val="Bibliography"/>
@@ -41764,7 +42202,7 @@
       <w:r>
         <w:t xml:space="preserve"> </w:t>
       </w:r>
-      <w:hyperlink r:id="rId383">
+      <w:hyperlink r:id="rId387">
         <w:r>
           <w:rPr>
             <w:rStyle w:val="Hyperlink"/>
@@ -41776,8 +42214,8 @@
         <w:t xml:space="preserve">.</w:t>
       </w:r>
     </w:p>
-    <w:bookmarkEnd w:id="384"/>
-    <w:bookmarkStart w:id="386" w:name="ref-stevens1974structured"/>
+    <w:bookmarkEnd w:id="388"/>
+    <w:bookmarkStart w:id="390" w:name="ref-stevens1974structured"/>
     <w:p>
       <w:pPr>
         <w:pStyle w:val="Bibliography"/>
@@ -41810,7 +42248,7 @@
       <w:r>
         <w:t xml:space="preserve"> </w:t>
       </w:r>
-      <w:hyperlink r:id="rId385">
+      <w:hyperlink r:id="rId389">
         <w:r>
           <w:rPr>
             <w:rStyle w:val="Hyperlink"/>
@@ -41822,8 +42260,8 @@
         <w:t xml:space="preserve">.</w:t>
       </w:r>
     </w:p>
-    <w:bookmarkEnd w:id="386"/>
-    <w:bookmarkStart w:id="388" w:name="ref-wickham2019advr"/>
+    <w:bookmarkEnd w:id="390"/>
+    <w:bookmarkStart w:id="392" w:name="ref-wickham2019advr"/>
     <w:p>
       <w:pPr>
         <w:pStyle w:val="Bibliography"/>
@@ -41847,7 +42285,7 @@
       <w:r>
         <w:t xml:space="preserve"> </w:t>
       </w:r>
-      <w:hyperlink r:id="rId387">
+      <w:hyperlink r:id="rId391">
         <w:r>
           <w:rPr>
             <w:rStyle w:val="Hyperlink"/>
@@ -41859,8 +42297,8 @@
         <w:t xml:space="preserve">.</w:t>
       </w:r>
     </w:p>
-    <w:bookmarkEnd w:id="388"/>
-    <w:bookmarkStart w:id="390" w:name="ref-wickham2021shiny"/>
+    <w:bookmarkEnd w:id="392"/>
+    <w:bookmarkStart w:id="394" w:name="ref-wickham2021shiny"/>
     <w:p>
       <w:pPr>
         <w:pStyle w:val="Bibliography"/>
@@ -41884,7 +42322,7 @@
       <w:r>
         <w:t xml:space="preserve"> </w:t>
       </w:r>
-      <w:hyperlink r:id="rId389">
+      <w:hyperlink r:id="rId393">
         <w:r>
           <w:rPr>
             <w:rStyle w:val="Hyperlink"/>
@@ -41896,8 +42334,8 @@
         <w:t xml:space="preserve">.</w:t>
       </w:r>
     </w:p>
-    <w:bookmarkEnd w:id="390"/>
-    <w:bookmarkStart w:id="392" w:name="ref-wickham2023tidydesign"/>
+    <w:bookmarkEnd w:id="394"/>
+    <w:bookmarkStart w:id="396" w:name="ref-wickham2023tidydesign"/>
     <w:p>
       <w:pPr>
         <w:pStyle w:val="Bibliography"/>
@@ -41921,7 +42359,7 @@
       <w:r>
         <w:t xml:space="preserve"> </w:t>
       </w:r>
-      <w:hyperlink r:id="rId391">
+      <w:hyperlink r:id="rId395">
         <w:r>
           <w:rPr>
             <w:rStyle w:val="Hyperlink"/>
@@ -41933,8 +42371,8 @@
         <w:t xml:space="preserve">.</w:t>
       </w:r>
     </w:p>
-    <w:bookmarkEnd w:id="392"/>
-    <w:bookmarkStart w:id="394" w:name="ref-wickham2023rpkgs"/>
+    <w:bookmarkEnd w:id="396"/>
+    <w:bookmarkStart w:id="398" w:name="ref-wickham2023rpkgs"/>
     <w:p>
       <w:pPr>
         <w:pStyle w:val="Bibliography"/>
@@ -41958,7 +42396,7 @@
       <w:r>
         <w:t xml:space="preserve"> </w:t>
       </w:r>
-      <w:hyperlink r:id="rId393">
+      <w:hyperlink r:id="rId397">
         <w:r>
           <w:rPr>
             <w:rStyle w:val="Hyperlink"/>
@@ -41970,8 +42408,8 @@
         <w:t xml:space="preserve">.</w:t>
       </w:r>
     </w:p>
-    <w:bookmarkEnd w:id="394"/>
-    <w:bookmarkStart w:id="396" w:name="ref-wickham2023r4ds"/>
+    <w:bookmarkEnd w:id="398"/>
+    <w:bookmarkStart w:id="400" w:name="ref-wickham2023r4ds"/>
     <w:p>
       <w:pPr>
         <w:pStyle w:val="Bibliography"/>
@@ -41995,7 +42433,7 @@
       <w:r>
         <w:t xml:space="preserve"> </w:t>
       </w:r>
-      <w:hyperlink r:id="rId395">
+      <w:hyperlink r:id="rId399">
         <w:r>
           <w:rPr>
             <w:rStyle w:val="Hyperlink"/>
@@ -42007,8 +42445,8 @@
         <w:t xml:space="preserve">.</w:t>
       </w:r>
     </w:p>
-    <w:bookmarkEnd w:id="396"/>
-    <w:bookmarkStart w:id="397" w:name="ref-R-roxygen2"/>
+    <w:bookmarkEnd w:id="400"/>
+    <w:bookmarkStart w:id="401" w:name="ref-R-roxygen2"/>
     <w:p>
       <w:pPr>
         <w:pStyle w:val="Bibliography"/>
@@ -42044,8 +42482,8 @@
         <w:t xml:space="preserve">.</w:t>
       </w:r>
     </w:p>
-    <w:bookmarkEnd w:id="397"/>
-    <w:bookmarkStart w:id="399" w:name="ref-wilson2014best"/>
+    <w:bookmarkEnd w:id="401"/>
+    <w:bookmarkStart w:id="403" w:name="ref-wilson2014best"/>
     <w:p>
       <w:pPr>
         <w:pStyle w:val="Bibliography"/>
@@ -42078,7 +42516,7 @@
       <w:r>
         <w:t xml:space="preserve"> </w:t>
       </w:r>
-      <w:hyperlink r:id="rId398">
+      <w:hyperlink r:id="rId402">
         <w:r>
           <w:rPr>
             <w:rStyle w:val="Hyperlink"/>
@@ -42090,8 +42528,8 @@
         <w:t xml:space="preserve">.</w:t>
       </w:r>
     </w:p>
-    <w:bookmarkEnd w:id="399"/>
-    <w:bookmarkStart w:id="401" w:name="ref-wilson2017good"/>
+    <w:bookmarkEnd w:id="403"/>
+    <w:bookmarkStart w:id="405" w:name="ref-wilson2017good"/>
     <w:p>
       <w:pPr>
         <w:pStyle w:val="Bibliography"/>
@@ -42124,7 +42562,7 @@
       <w:r>
         <w:t xml:space="preserve"> </w:t>
       </w:r>
-      <w:hyperlink r:id="rId400">
+      <w:hyperlink r:id="rId404">
         <w:r>
           <w:rPr>
             <w:rStyle w:val="Hyperlink"/>
@@ -42136,10 +42574,10 @@
         <w:t xml:space="preserve">.</w:t>
       </w:r>
     </w:p>
-    <w:bookmarkEnd w:id="401"/>
-    <w:bookmarkEnd w:id="402"/>
-    <w:bookmarkEnd w:id="403"/>
-    <w:bookmarkEnd w:id="404"/>
+    <w:bookmarkEnd w:id="405"/>
+    <w:bookmarkEnd w:id="406"/>
+    <w:bookmarkEnd w:id="407"/>
+    <w:bookmarkEnd w:id="408"/>
     <w:sectPr>
       <w:footnotePr>
         <w:numRestart w:val="eachSect"/>
@@ -42857,6 +43295,9 @@
     <w:abstractNumId w:val="991"/>
   </w:num>
   <w:num w:numId="1069">
+    <w:abstractNumId w:val="991"/>
+  </w:num>
+  <w:num w:numId="1070">
     <w:abstractNumId w:val="99411"/>
     <w:lvlOverride w:ilvl="0">
       <w:startOverride w:val="1"/>
@@ -42885,9 +43326,6 @@
     <w:lvlOverride w:ilvl="8">
       <w:startOverride w:val="1"/>
     </w:lvlOverride>
-  </w:num>
-  <w:num w:numId="1070">
-    <w:abstractNumId w:val="991"/>
   </w:num>
   <w:num w:numId="1071">
     <w:abstractNumId w:val="991"/>
@@ -42935,6 +43373,9 @@
     <w:abstractNumId w:val="991"/>
   </w:num>
   <w:num w:numId="1086">
+    <w:abstractNumId w:val="991"/>
+  </w:num>
+  <w:num w:numId="1087">
     <w:abstractNumId w:val="991"/>
   </w:num>
 </w:numbering>

</xml_diff>